<commit_message>
Valida fase 10 planes y evidencias
</commit_message>
<xml_diff>
--- a/docs/3. Módulo Matrices de Riesgos/Fase 10 - Planes de accion evidencias y seguimiento/Fase_10_Planes_Accion_Evidencias_Seguimiento_Matrices_Riesgos_SGRLA_IHSS.docx
+++ b/docs/3. Módulo Matrices de Riesgos/Fase 10 - Planes de accion evidencias y seguimiento/Fase_10_Planes_Accion_Evidencias_Seguimiento_Matrices_Riesgos_SGRLA_IHSS.docx
@@ -9,10 +9,10 @@
       <w:r>
         <w:rPr>
           <w:b/>
-          <w:color w:val="1F3A5F"/>
-          <w:sz w:val="36"/>
+          <w:color w:val="1F3F8D"/>
+          <w:sz w:val="28"/>
         </w:rPr>
-        <w:t>Fase 10. Planes de Acción, Evidencias y Seguimiento</w:t>
+        <w:t>Sistema de Gestión de Riesgos LA/FT - IHSS</w:t>
       </w:r>
     </w:p>
     <w:p>
@@ -21,25 +21,13 @@
       </w:pPr>
       <w:r>
         <w:rPr>
-          <w:color w:val="44546A"/>
-          <w:sz w:val="26"/>
+          <w:b/>
+          <w:color w:val="1F3F8D"/>
+          <w:sz w:val="32"/>
         </w:rPr>
-        <w:t>Módulo 3. Matrices de Riesgos SGRLA-IHSS</w:t>
+        <w:t>Fase 10. Planes de Acción, Evidencias y Seguimiento</w:t>
       </w:r>
     </w:p>
-    <w:p>
-      <w:pPr>
-        <w:jc w:val="center"/>
-      </w:pPr>
-      <w:r>
-        <w:rPr>
-          <w:i/>
-          <w:sz w:val="20"/>
-        </w:rPr>
-        <w:t>Documento técnico para revisión funcional y técnica</w:t>
-      </w:r>
-    </w:p>
-    <w:p/>
     <w:tbl>
       <w:tblPr>
         <w:tblStyle w:val="TableGrid"/>
@@ -48,26 +36,22 @@
         <w:tblLook w:firstColumn="1" w:firstRow="1" w:lastColumn="0" w:lastRow="0" w:noHBand="0" w:noVBand="1" w:val="04A0"/>
       </w:tblPr>
       <w:tblGrid>
-        <w:gridCol w:w="4680"/>
-        <w:gridCol w:w="4680"/>
+        <w:gridCol w:w="5112"/>
+        <w:gridCol w:w="5112"/>
       </w:tblGrid>
       <w:tr>
         <w:tc>
           <w:tcPr>
             <w:tcW w:type="dxa" w:w="2448"/>
-            <w:shd w:fill="E8EEF5"/>
             <w:vAlign w:val="center"/>
+            <w:shd w:fill="1F3F8D"/>
           </w:tcPr>
           <w:p>
-            <w:pPr>
-              <w:spacing w:after="0"/>
-            </w:pPr>
             <w:r/>
             <w:r>
               <w:rPr>
-                <w:rFonts w:ascii="Calibri" w:hAnsi="Calibri"/>
                 <w:b/>
-                <w:color w:val="0B2545"/>
+                <w:color w:val="FFFFFF"/>
                 <w:sz w:val="18"/>
               </w:rPr>
               <w:t>Campo</w:t>
@@ -76,20 +60,16 @@
         </w:tc>
         <w:tc>
           <w:tcPr>
-            <w:tcW w:type="dxa" w:w="6768"/>
-            <w:shd w:fill="E8EEF5"/>
+            <w:tcW w:type="dxa" w:w="8208"/>
             <w:vAlign w:val="center"/>
+            <w:shd w:fill="1F3F8D"/>
           </w:tcPr>
           <w:p>
-            <w:pPr>
-              <w:spacing w:after="0"/>
-            </w:pPr>
             <w:r/>
             <w:r>
               <w:rPr>
-                <w:rFonts w:ascii="Calibri" w:hAnsi="Calibri"/>
                 <w:b/>
-                <w:color w:val="0B2545"/>
+                <w:color w:val="FFFFFF"/>
                 <w:sz w:val="18"/>
               </w:rPr>
               <w:t>Detalle</w:t>
@@ -104,13 +84,111 @@
             <w:vAlign w:val="center"/>
           </w:tcPr>
           <w:p>
-            <w:pPr>
-              <w:spacing w:after="0"/>
-            </w:pPr>
             <w:r/>
             <w:r>
               <w:rPr>
-                <w:rFonts w:ascii="Calibri" w:hAnsi="Calibri"/>
+                <w:b w:val="0"/>
+                <w:sz w:val="18"/>
+              </w:rPr>
+              <w:t>Módulo</w:t>
+            </w:r>
+          </w:p>
+        </w:tc>
+        <w:tc>
+          <w:tcPr>
+            <w:tcW w:type="dxa" w:w="8208"/>
+            <w:vAlign w:val="center"/>
+          </w:tcPr>
+          <w:p>
+            <w:r/>
+            <w:r>
+              <w:rPr>
+                <w:b w:val="0"/>
+                <w:sz w:val="18"/>
+              </w:rPr>
+              <w:t>Módulo 3. Matrices de Riesgos</w:t>
+            </w:r>
+          </w:p>
+        </w:tc>
+      </w:tr>
+      <w:tr>
+        <w:tc>
+          <w:tcPr>
+            <w:tcW w:type="dxa" w:w="2448"/>
+            <w:vAlign w:val="center"/>
+          </w:tcPr>
+          <w:p>
+            <w:r/>
+            <w:r>
+              <w:rPr>
+                <w:b w:val="0"/>
+                <w:sz w:val="18"/>
+              </w:rPr>
+              <w:t>Versión</w:t>
+            </w:r>
+          </w:p>
+        </w:tc>
+        <w:tc>
+          <w:tcPr>
+            <w:tcW w:type="dxa" w:w="8208"/>
+            <w:vAlign w:val="center"/>
+          </w:tcPr>
+          <w:p>
+            <w:r/>
+            <w:r>
+              <w:rPr>
+                <w:b w:val="0"/>
+                <w:sz w:val="18"/>
+              </w:rPr>
+              <w:t>1.1</w:t>
+            </w:r>
+          </w:p>
+        </w:tc>
+      </w:tr>
+      <w:tr>
+        <w:tc>
+          <w:tcPr>
+            <w:tcW w:type="dxa" w:w="2448"/>
+            <w:vAlign w:val="center"/>
+          </w:tcPr>
+          <w:p>
+            <w:r/>
+            <w:r>
+              <w:rPr>
+                <w:b w:val="0"/>
+                <w:sz w:val="18"/>
+              </w:rPr>
+              <w:t>Estado</w:t>
+            </w:r>
+          </w:p>
+        </w:tc>
+        <w:tc>
+          <w:tcPr>
+            <w:tcW w:type="dxa" w:w="8208"/>
+            <w:vAlign w:val="center"/>
+          </w:tcPr>
+          <w:p>
+            <w:r/>
+            <w:r>
+              <w:rPr>
+                <w:b w:val="0"/>
+                <w:sz w:val="18"/>
+              </w:rPr>
+              <w:t>Fase 10 validada técnicamente y lista para aprobación formal</w:t>
+            </w:r>
+          </w:p>
+        </w:tc>
+      </w:tr>
+      <w:tr>
+        <w:tc>
+          <w:tcPr>
+            <w:tcW w:type="dxa" w:w="2448"/>
+            <w:vAlign w:val="center"/>
+          </w:tcPr>
+          <w:p>
+            <w:r/>
+            <w:r>
+              <w:rPr>
                 <w:b w:val="0"/>
                 <w:sz w:val="18"/>
               </w:rPr>
@@ -120,17 +198,13 @@
         </w:tc>
         <w:tc>
           <w:tcPr>
-            <w:tcW w:type="dxa" w:w="6768"/>
+            <w:tcW w:type="dxa" w:w="8208"/>
             <w:vAlign w:val="center"/>
           </w:tcPr>
           <w:p>
-            <w:pPr>
-              <w:spacing w:after="0"/>
-            </w:pPr>
             <w:r/>
             <w:r>
               <w:rPr>
-                <w:rFonts w:ascii="Calibri" w:hAnsi="Calibri"/>
                 <w:b w:val="0"/>
                 <w:sz w:val="18"/>
               </w:rPr>
@@ -146,37 +220,29 @@
             <w:vAlign w:val="center"/>
           </w:tcPr>
           <w:p>
-            <w:pPr>
-              <w:spacing w:after="0"/>
-            </w:pPr>
             <w:r/>
             <w:r>
               <w:rPr>
-                <w:rFonts w:ascii="Calibri" w:hAnsi="Calibri"/>
                 <w:b w:val="0"/>
                 <w:sz w:val="18"/>
               </w:rPr>
-              <w:t>Fecha</w:t>
+              <w:t>Fecha de actualización</w:t>
             </w:r>
           </w:p>
         </w:tc>
         <w:tc>
           <w:tcPr>
-            <w:tcW w:type="dxa" w:w="6768"/>
+            <w:tcW w:type="dxa" w:w="8208"/>
             <w:vAlign w:val="center"/>
           </w:tcPr>
           <w:p>
-            <w:pPr>
-              <w:spacing w:after="0"/>
-            </w:pPr>
             <w:r/>
             <w:r>
               <w:rPr>
-                <w:rFonts w:ascii="Calibri" w:hAnsi="Calibri"/>
                 <w:b w:val="0"/>
                 <w:sz w:val="18"/>
               </w:rPr>
-              <w:t>15 de julio de 2026</w:t>
+              <w:t>16/07/2026</w:t>
             </w:r>
           </w:p>
         </w:tc>
@@ -188,97 +254,9 @@
             <w:vAlign w:val="center"/>
           </w:tcPr>
           <w:p>
-            <w:pPr>
-              <w:spacing w:after="0"/>
-            </w:pPr>
             <w:r/>
             <w:r>
               <w:rPr>
-                <w:rFonts w:ascii="Calibri" w:hAnsi="Calibri"/>
-                <w:b w:val="0"/>
-                <w:sz w:val="18"/>
-              </w:rPr>
-              <w:t>Versión</w:t>
-            </w:r>
-          </w:p>
-        </w:tc>
-        <w:tc>
-          <w:tcPr>
-            <w:tcW w:type="dxa" w:w="6768"/>
-            <w:vAlign w:val="center"/>
-          </w:tcPr>
-          <w:p>
-            <w:pPr>
-              <w:spacing w:after="0"/>
-            </w:pPr>
-            <w:r/>
-            <w:r>
-              <w:rPr>
-                <w:rFonts w:ascii="Calibri" w:hAnsi="Calibri"/>
-                <w:b w:val="0"/>
-                <w:sz w:val="18"/>
-              </w:rPr>
-              <w:t>1.0</w:t>
-            </w:r>
-          </w:p>
-        </w:tc>
-      </w:tr>
-      <w:tr>
-        <w:tc>
-          <w:tcPr>
-            <w:tcW w:type="dxa" w:w="2448"/>
-            <w:vAlign w:val="center"/>
-          </w:tcPr>
-          <w:p>
-            <w:pPr>
-              <w:spacing w:after="0"/>
-            </w:pPr>
-            <w:r/>
-            <w:r>
-              <w:rPr>
-                <w:rFonts w:ascii="Calibri" w:hAnsi="Calibri"/>
-                <w:b w:val="0"/>
-                <w:sz w:val="18"/>
-              </w:rPr>
-              <w:t>Estado</w:t>
-            </w:r>
-          </w:p>
-        </w:tc>
-        <w:tc>
-          <w:tcPr>
-            <w:tcW w:type="dxa" w:w="6768"/>
-            <w:vAlign w:val="center"/>
-          </w:tcPr>
-          <w:p>
-            <w:pPr>
-              <w:spacing w:after="0"/>
-            </w:pPr>
-            <w:r/>
-            <w:r>
-              <w:rPr>
-                <w:rFonts w:ascii="Calibri" w:hAnsi="Calibri"/>
-                <w:b w:val="0"/>
-                <w:sz w:val="18"/>
-              </w:rPr>
-              <w:t>Fase 10 implementada para validación técnica</w:t>
-            </w:r>
-          </w:p>
-        </w:tc>
-      </w:tr>
-      <w:tr>
-        <w:tc>
-          <w:tcPr>
-            <w:tcW w:type="dxa" w:w="2448"/>
-            <w:vAlign w:val="center"/>
-          </w:tcPr>
-          <w:p>
-            <w:pPr>
-              <w:spacing w:after="0"/>
-            </w:pPr>
-            <w:r/>
-            <w:r>
-              <w:rPr>
-                <w:rFonts w:ascii="Calibri" w:hAnsi="Calibri"/>
                 <w:b w:val="0"/>
                 <w:sz w:val="18"/>
               </w:rPr>
@@ -288,21 +266,17 @@
         </w:tc>
         <w:tc>
           <w:tcPr>
-            <w:tcW w:type="dxa" w:w="6768"/>
+            <w:tcW w:type="dxa" w:w="8208"/>
             <w:vAlign w:val="center"/>
           </w:tcPr>
           <w:p>
-            <w:pPr>
-              <w:spacing w:after="0"/>
-            </w:pPr>
             <w:r/>
             <w:r>
               <w:rPr>
-                <w:rFonts w:ascii="Calibri" w:hAnsi="Calibri"/>
                 <w:b w:val="0"/>
                 <w:sz w:val="18"/>
               </w:rPr>
-              <w:t>Plan de fases del Módulo 3, Fases 1 a 9 aprobadas/cerradas y código vigente del repositorio local.</w:t>
+              <w:t>Fases 1 a 9 aprobadas/cerradas y backend/frontend vigente del sistema</w:t>
             </w:r>
           </w:p>
         </w:tc>
@@ -314,11 +288,7 @@
         <w:pStyle w:val="Heading1"/>
       </w:pPr>
       <w:r>
-        <w:rPr>
-          <w:rFonts w:ascii="Calibri" w:hAnsi="Calibri"/>
-          <w:color w:val="2E74B5"/>
-        </w:rPr>
-        <w:t>1. Control de Cambios</w:t>
+        <w:t>1. Control de cambios</w:t>
       </w:r>
     </w:p>
     <w:tbl>
@@ -329,29 +299,25 @@
         <w:tblLook w:firstColumn="1" w:firstRow="1" w:lastColumn="0" w:lastRow="0" w:noHBand="0" w:noVBand="1" w:val="04A0"/>
       </w:tblPr>
       <w:tblGrid>
-        <w:gridCol w:w="1872"/>
-        <w:gridCol w:w="1872"/>
-        <w:gridCol w:w="1872"/>
-        <w:gridCol w:w="1872"/>
-        <w:gridCol w:w="1872"/>
+        <w:gridCol w:w="2045"/>
+        <w:gridCol w:w="2045"/>
+        <w:gridCol w:w="2045"/>
+        <w:gridCol w:w="2045"/>
+        <w:gridCol w:w="2045"/>
       </w:tblGrid>
       <w:tr>
         <w:tc>
           <w:tcPr>
             <w:tcW w:type="dxa" w:w="1152"/>
-            <w:shd w:fill="E8EEF5"/>
             <w:vAlign w:val="center"/>
+            <w:shd w:fill="1F3F8D"/>
           </w:tcPr>
           <w:p>
-            <w:pPr>
-              <w:spacing w:after="0"/>
-            </w:pPr>
             <w:r/>
             <w:r>
               <w:rPr>
-                <w:rFonts w:ascii="Calibri" w:hAnsi="Calibri"/>
                 <w:b/>
-                <w:color w:val="0B2545"/>
+                <w:color w:val="FFFFFF"/>
                 <w:sz w:val="18"/>
               </w:rPr>
               <w:t>Versión</w:t>
@@ -360,20 +326,16 @@
         </w:tc>
         <w:tc>
           <w:tcPr>
-            <w:tcW w:type="dxa" w:w="1440"/>
-            <w:shd w:fill="E8EEF5"/>
+            <w:tcW w:type="dxa" w:w="1584"/>
             <w:vAlign w:val="center"/>
+            <w:shd w:fill="1F3F8D"/>
           </w:tcPr>
           <w:p>
-            <w:pPr>
-              <w:spacing w:after="0"/>
-            </w:pPr>
             <w:r/>
             <w:r>
               <w:rPr>
-                <w:rFonts w:ascii="Calibri" w:hAnsi="Calibri"/>
                 <w:b/>
-                <w:color w:val="0B2545"/>
+                <w:color w:val="FFFFFF"/>
                 <w:sz w:val="18"/>
               </w:rPr>
               <w:t>Fecha</w:t>
@@ -382,20 +344,16 @@
         </w:tc>
         <w:tc>
           <w:tcPr>
-            <w:tcW w:type="dxa" w:w="4464"/>
-            <w:shd w:fill="E8EEF5"/>
+            <w:tcW w:type="dxa" w:w="5616"/>
             <w:vAlign w:val="center"/>
+            <w:shd w:fill="1F3F8D"/>
           </w:tcPr>
           <w:p>
-            <w:pPr>
-              <w:spacing w:after="0"/>
-            </w:pPr>
             <w:r/>
             <w:r>
               <w:rPr>
-                <w:rFonts w:ascii="Calibri" w:hAnsi="Calibri"/>
                 <w:b/>
-                <w:color w:val="0B2545"/>
+                <w:color w:val="FFFFFF"/>
                 <w:sz w:val="18"/>
               </w:rPr>
               <w:t>Descripción</w:t>
@@ -404,20 +362,16 @@
         </w:tc>
         <w:tc>
           <w:tcPr>
-            <w:tcW w:type="dxa" w:w="1728"/>
-            <w:shd w:fill="E8EEF5"/>
+            <w:tcW w:type="dxa" w:w="2016"/>
             <w:vAlign w:val="center"/>
+            <w:shd w:fill="1F3F8D"/>
           </w:tcPr>
           <w:p>
-            <w:pPr>
-              <w:spacing w:after="0"/>
-            </w:pPr>
             <w:r/>
             <w:r>
               <w:rPr>
-                <w:rFonts w:ascii="Calibri" w:hAnsi="Calibri"/>
                 <w:b/>
-                <w:color w:val="0B2545"/>
+                <w:color w:val="FFFFFF"/>
                 <w:sz w:val="18"/>
               </w:rPr>
               <w:t>Responsable</w:t>
@@ -426,20 +380,16 @@
         </w:tc>
         <w:tc>
           <w:tcPr>
-            <w:tcW w:type="dxa" w:w="1584"/>
-            <w:shd w:fill="E8EEF5"/>
+            <w:tcW w:type="dxa" w:w="2016"/>
             <w:vAlign w:val="center"/>
+            <w:shd w:fill="1F3F8D"/>
           </w:tcPr>
           <w:p>
-            <w:pPr>
-              <w:spacing w:after="0"/>
-            </w:pPr>
             <w:r/>
             <w:r>
               <w:rPr>
-                <w:rFonts w:ascii="Calibri" w:hAnsi="Calibri"/>
                 <w:b/>
-                <w:color w:val="0B2545"/>
+                <w:color w:val="FFFFFF"/>
                 <w:sz w:val="18"/>
               </w:rPr>
               <w:t>Estado</w:t>
@@ -454,13 +404,9 @@
             <w:vAlign w:val="center"/>
           </w:tcPr>
           <w:p>
-            <w:pPr>
-              <w:spacing w:after="0"/>
-            </w:pPr>
             <w:r/>
             <w:r>
               <w:rPr>
-                <w:rFonts w:ascii="Calibri" w:hAnsi="Calibri"/>
                 <w:b w:val="0"/>
                 <w:sz w:val="18"/>
               </w:rPr>
@@ -470,17 +416,13 @@
         </w:tc>
         <w:tc>
           <w:tcPr>
-            <w:tcW w:type="dxa" w:w="1440"/>
+            <w:tcW w:type="dxa" w:w="1584"/>
             <w:vAlign w:val="center"/>
           </w:tcPr>
           <w:p>
-            <w:pPr>
-              <w:spacing w:after="0"/>
-            </w:pPr>
             <w:r/>
             <w:r>
               <w:rPr>
-                <w:rFonts w:ascii="Calibri" w:hAnsi="Calibri"/>
                 <w:b w:val="0"/>
                 <w:sz w:val="18"/>
               </w:rPr>
@@ -490,37 +432,29 @@
         </w:tc>
         <w:tc>
           <w:tcPr>
-            <w:tcW w:type="dxa" w:w="4464"/>
+            <w:tcW w:type="dxa" w:w="5616"/>
             <w:vAlign w:val="center"/>
           </w:tcPr>
           <w:p>
-            <w:pPr>
-              <w:spacing w:after="0"/>
-            </w:pPr>
             <w:r/>
             <w:r>
               <w:rPr>
-                <w:rFonts w:ascii="Calibri" w:hAnsi="Calibri"/>
                 <w:b w:val="0"/>
                 <w:sz w:val="18"/>
               </w:rPr>
-              <w:t>Implementación inicial de planes de acción, evidencias documentales, seguimiento, reglas de bloqueo y trazabilidad de Fase 10.</w:t>
+              <w:t>Documento inicial de implementación de planes, evidencias y seguimiento.</w:t>
             </w:r>
           </w:p>
         </w:tc>
         <w:tc>
           <w:tcPr>
-            <w:tcW w:type="dxa" w:w="1728"/>
+            <w:tcW w:type="dxa" w:w="2016"/>
             <w:vAlign w:val="center"/>
           </w:tcPr>
           <w:p>
-            <w:pPr>
-              <w:spacing w:after="0"/>
-            </w:pPr>
             <w:r/>
             <w:r>
               <w:rPr>
-                <w:rFonts w:ascii="Calibri" w:hAnsi="Calibri"/>
                 <w:b w:val="0"/>
                 <w:sz w:val="18"/>
               </w:rPr>
@@ -530,21 +464,99 @@
         </w:tc>
         <w:tc>
           <w:tcPr>
+            <w:tcW w:type="dxa" w:w="2016"/>
+            <w:vAlign w:val="center"/>
+          </w:tcPr>
+          <w:p>
+            <w:r/>
+            <w:r>
+              <w:rPr>
+                <w:b w:val="0"/>
+                <w:sz w:val="18"/>
+              </w:rPr>
+              <w:t>Para validación técnica</w:t>
+            </w:r>
+          </w:p>
+        </w:tc>
+      </w:tr>
+      <w:tr>
+        <w:tc>
+          <w:tcPr>
+            <w:tcW w:type="dxa" w:w="1152"/>
+            <w:vAlign w:val="center"/>
+          </w:tcPr>
+          <w:p>
+            <w:r/>
+            <w:r>
+              <w:rPr>
+                <w:b w:val="0"/>
+                <w:sz w:val="18"/>
+              </w:rPr>
+              <w:t>1.1</w:t>
+            </w:r>
+          </w:p>
+        </w:tc>
+        <w:tc>
+          <w:tcPr>
             <w:tcW w:type="dxa" w:w="1584"/>
             <w:vAlign w:val="center"/>
           </w:tcPr>
           <w:p>
-            <w:pPr>
-              <w:spacing w:after="0"/>
-            </w:pPr>
             <w:r/>
             <w:r>
               <w:rPr>
-                <w:rFonts w:ascii="Calibri" w:hAnsi="Calibri"/>
                 <w:b w:val="0"/>
                 <w:sz w:val="18"/>
               </w:rPr>
-              <w:t>Para revisión</w:t>
+              <w:t>16/07/2026</w:t>
+            </w:r>
+          </w:p>
+        </w:tc>
+        <w:tc>
+          <w:tcPr>
+            <w:tcW w:type="dxa" w:w="5616"/>
+            <w:vAlign w:val="center"/>
+          </w:tcPr>
+          <w:p>
+            <w:r/>
+            <w:r>
+              <w:rPr>
+                <w:b w:val="0"/>
+                <w:sz w:val="18"/>
+              </w:rPr>
+              <w:t>Validación funcional API y DBA completada; evidencia de planes, evidencias, historial y auditoría generada.</w:t>
+            </w:r>
+          </w:p>
+        </w:tc>
+        <w:tc>
+          <w:tcPr>
+            <w:tcW w:type="dxa" w:w="2016"/>
+            <w:vAlign w:val="center"/>
+          </w:tcPr>
+          <w:p>
+            <w:r/>
+            <w:r>
+              <w:rPr>
+                <w:b w:val="0"/>
+                <w:sz w:val="18"/>
+              </w:rPr>
+              <w:t>Javier Mejía</w:t>
+            </w:r>
+          </w:p>
+        </w:tc>
+        <w:tc>
+          <w:tcPr>
+            <w:tcW w:type="dxa" w:w="2016"/>
+            <w:vAlign w:val="center"/>
+          </w:tcPr>
+          <w:p>
+            <w:r/>
+            <w:r>
+              <w:rPr>
+                <w:b w:val="0"/>
+                <w:sz w:val="18"/>
+              </w:rPr>
+              <w:t>Validada técnicamente</w:t>
             </w:r>
           </w:p>
         </w:tc>
@@ -556,16 +568,12 @@
         <w:pStyle w:val="Heading1"/>
       </w:pPr>
       <w:r>
-        <w:rPr>
-          <w:rFonts w:ascii="Calibri" w:hAnsi="Calibri"/>
-          <w:color w:val="2E74B5"/>
-        </w:rPr>
-        <w:t>2. Objetivo</w:t>
+        <w:t>2. Objetivo de la fase</w:t>
       </w:r>
     </w:p>
     <w:p>
       <w:r>
-        <w:t>Asegurar que las matrices con riesgo residual no aceptable cuenten con tratamiento formal mediante planes de acción, responsables, fechas compromiso, evidencias documentales, historial funcional, auditoría e impedimentos de cierre cuando corresponda.</w:t>
+        <w:t>Validar la integración funcional de planes de acción, evidencias documentales y seguimiento de matrices de riesgos, asegurando trazabilidad, auditoría, eliminación lógica, motivos obligatorios y separación total frente a otros módulos del sistema.</w:t>
       </w:r>
     </w:p>
     <w:p>
@@ -573,105 +581,224 @@
         <w:pStyle w:val="Heading1"/>
       </w:pPr>
       <w:r>
-        <w:rPr>
-          <w:rFonts w:ascii="Calibri" w:hAnsi="Calibri"/>
-          <w:color w:val="2E74B5"/>
-        </w:rPr>
-        <w:t>3. Alcance Implementado</w:t>
-      </w:r>
-    </w:p>
-    <w:p>
-      <w:pPr>
-        <w:pStyle w:val="ListBullet"/>
-        <w:spacing w:after="80"/>
-      </w:pPr>
-      <w:r>
-        <w:t>Creación, edición, cambio de estado e inactivación lógica de planes de acción asociados a una matriz.</w:t>
-      </w:r>
-    </w:p>
-    <w:p>
-      <w:pPr>
-        <w:pStyle w:val="ListBullet"/>
-        <w:spacing w:after="80"/>
-      </w:pPr>
-      <w:r>
-        <w:t>Carga, descarga/visualización e inactivación lógica de evidencias vinculadas a matriz, control o plan.</w:t>
-      </w:r>
-    </w:p>
-    <w:p>
-      <w:pPr>
-        <w:pStyle w:val="ListBullet"/>
-        <w:spacing w:after="80"/>
-      </w:pPr>
-      <w:r>
-        <w:t>Bloqueo del estado CERRADA cuando la matriz requiere plan de acción y no existe plan cerrado con motivo de cierre.</w:t>
-      </w:r>
-    </w:p>
-    <w:p>
-      <w:pPr>
-        <w:pStyle w:val="ListBullet"/>
-        <w:spacing w:after="80"/>
-      </w:pPr>
-      <w:r>
-        <w:t>Registro de historial funcional en RL_MR_HISTORIAL y auditoría obligatoria en RL_AUDITORIA.</w:t>
-      </w:r>
-    </w:p>
-    <w:p>
-      <w:pPr>
-        <w:pStyle w:val="ListBullet"/>
-        <w:spacing w:after="80"/>
-      </w:pPr>
-      <w:r>
-        <w:t>Validaciones backend para impedir referencias cruzadas entre matrices, controles, planes y resultados.</w:t>
-      </w:r>
-    </w:p>
-    <w:p>
-      <w:pPr>
-        <w:pStyle w:val="ListBullet"/>
-        <w:spacing w:after="80"/>
-      </w:pPr>
-      <w:r>
-        <w:t>Interfaz Angular para administrar planes y evidencias sin calcular riesgo en frontend.</w:t>
+        <w:t>3. Alcance validado</w:t>
       </w:r>
     </w:p>
     <w:tbl>
       <w:tblPr>
         <w:tblStyle w:val="TableGrid"/>
         <w:tblW w:type="auto" w:w="0"/>
+        <w:jc w:val="center"/>
         <w:tblLook w:firstColumn="1" w:firstRow="1" w:lastColumn="0" w:lastRow="0" w:noHBand="0" w:noVBand="1" w:val="04A0"/>
       </w:tblPr>
       <w:tblGrid>
-        <w:gridCol w:w="9360"/>
+        <w:gridCol w:w="5112"/>
+        <w:gridCol w:w="5112"/>
       </w:tblGrid>
       <w:tr>
         <w:tc>
           <w:tcPr>
-            <w:tcW w:type="dxa" w:w="9360"/>
-            <w:shd w:fill="FFF4CE"/>
+            <w:tcW w:type="dxa" w:w="2736"/>
+            <w:vAlign w:val="center"/>
+            <w:shd w:fill="1F3F8D"/>
           </w:tcPr>
           <w:p>
-            <w:pPr>
-              <w:spacing w:after="60"/>
-            </w:pPr>
             <w:r/>
             <w:r>
               <w:rPr>
                 <w:b/>
-                <w:color w:val="1F3A5F"/>
-                <w:sz w:val="20"/>
+                <w:color w:val="FFFFFF"/>
+                <w:sz w:val="18"/>
               </w:rPr>
-              <w:t>Regla institucional mantenida</w:t>
+              <w:t>Componente</w:t>
             </w:r>
           </w:p>
+        </w:tc>
+        <w:tc>
+          <w:tcPr>
+            <w:tcW w:type="dxa" w:w="7920"/>
+            <w:vAlign w:val="center"/>
+            <w:shd w:fill="1F3F8D"/>
+          </w:tcPr>
           <w:p>
-            <w:pPr>
-              <w:spacing w:after="0"/>
-            </w:pPr>
+            <w:r/>
             <w:r>
               <w:rPr>
+                <w:b/>
+                <w:color w:val="FFFFFF"/>
                 <w:sz w:val="18"/>
               </w:rPr>
-              <w:t>La política de permisos sigue siendo por módulo. No se incorporaron permisos por acción y no se modificó la autorización base: JWT + ModuloAuthorize(10).</w:t>
+              <w:t>Resultado</w:t>
+            </w:r>
+          </w:p>
+        </w:tc>
+      </w:tr>
+      <w:tr>
+        <w:tc>
+          <w:tcPr>
+            <w:tcW w:type="dxa" w:w="2736"/>
+            <w:vAlign w:val="center"/>
+          </w:tcPr>
+          <w:p>
+            <w:r/>
+            <w:r>
+              <w:rPr>
+                <w:b w:val="0"/>
+                <w:sz w:val="18"/>
+              </w:rPr>
+              <w:t>Planes de acción</w:t>
+            </w:r>
+          </w:p>
+        </w:tc>
+        <w:tc>
+          <w:tcPr>
+            <w:tcW w:type="dxa" w:w="7920"/>
+            <w:vAlign w:val="center"/>
+          </w:tcPr>
+          <w:p>
+            <w:r/>
+            <w:r>
+              <w:rPr>
+                <w:b w:val="0"/>
+                <w:sz w:val="18"/>
+              </w:rPr>
+              <w:t>Creación, edición, cambio de estado, inactivación y reactivación con motivo obligatorio validados por API.</w:t>
+            </w:r>
+          </w:p>
+        </w:tc>
+      </w:tr>
+      <w:tr>
+        <w:tc>
+          <w:tcPr>
+            <w:tcW w:type="dxa" w:w="2736"/>
+            <w:vAlign w:val="center"/>
+          </w:tcPr>
+          <w:p>
+            <w:r/>
+            <w:r>
+              <w:rPr>
+                <w:b w:val="0"/>
+                <w:sz w:val="18"/>
+              </w:rPr>
+              <w:t>Evidencias documentales</w:t>
+            </w:r>
+          </w:p>
+        </w:tc>
+        <w:tc>
+          <w:tcPr>
+            <w:tcW w:type="dxa" w:w="7920"/>
+            <w:vAlign w:val="center"/>
+          </w:tcPr>
+          <w:p>
+            <w:r/>
+            <w:r>
+              <w:rPr>
+                <w:b w:val="0"/>
+                <w:sz w:val="18"/>
+              </w:rPr>
+              <w:t>Carga, listado, descarga y eliminación lógica validadas con archivo menor a 10 MB.</w:t>
+            </w:r>
+          </w:p>
+        </w:tc>
+      </w:tr>
+      <w:tr>
+        <w:tc>
+          <w:tcPr>
+            <w:tcW w:type="dxa" w:w="2736"/>
+            <w:vAlign w:val="center"/>
+          </w:tcPr>
+          <w:p>
+            <w:r/>
+            <w:r>
+              <w:rPr>
+                <w:b w:val="0"/>
+                <w:sz w:val="18"/>
+              </w:rPr>
+              <w:t>Historial funcional</w:t>
+            </w:r>
+          </w:p>
+        </w:tc>
+        <w:tc>
+          <w:tcPr>
+            <w:tcW w:type="dxa" w:w="7920"/>
+            <w:vAlign w:val="center"/>
+          </w:tcPr>
+          <w:p>
+            <w:r/>
+            <w:r>
+              <w:rPr>
+                <w:b w:val="0"/>
+                <w:sz w:val="18"/>
+              </w:rPr>
+              <w:t>Eventos de planes y evidencias reflejados en historial de la matriz.</w:t>
+            </w:r>
+          </w:p>
+        </w:tc>
+      </w:tr>
+      <w:tr>
+        <w:tc>
+          <w:tcPr>
+            <w:tcW w:type="dxa" w:w="2736"/>
+            <w:vAlign w:val="center"/>
+          </w:tcPr>
+          <w:p>
+            <w:r/>
+            <w:r>
+              <w:rPr>
+                <w:b w:val="0"/>
+                <w:sz w:val="18"/>
+              </w:rPr>
+              <w:t>Auditoría</w:t>
+            </w:r>
+          </w:p>
+        </w:tc>
+        <w:tc>
+          <w:tcPr>
+            <w:tcW w:type="dxa" w:w="7920"/>
+            <w:vAlign w:val="center"/>
+          </w:tcPr>
+          <w:p>
+            <w:r/>
+            <w:r>
+              <w:rPr>
+                <w:b w:val="0"/>
+                <w:sz w:val="18"/>
+              </w:rPr>
+              <w:t>Registros detectados en auditoría para RL_MR_PLANES_ACCION y RL_MR_EVIDENCIAS.</w:t>
+            </w:r>
+          </w:p>
+        </w:tc>
+      </w:tr>
+      <w:tr>
+        <w:tc>
+          <w:tcPr>
+            <w:tcW w:type="dxa" w:w="2736"/>
+            <w:vAlign w:val="center"/>
+          </w:tcPr>
+          <w:p>
+            <w:r/>
+            <w:r>
+              <w:rPr>
+                <w:b w:val="0"/>
+                <w:sz w:val="18"/>
+              </w:rPr>
+              <w:t>Reglas de cierre</w:t>
+            </w:r>
+          </w:p>
+        </w:tc>
+        <w:tc>
+          <w:tcPr>
+            <w:tcW w:type="dxa" w:w="7920"/>
+            <w:vAlign w:val="center"/>
+          </w:tcPr>
+          <w:p>
+            <w:r/>
+            <w:r>
+              <w:rPr>
+                <w:b w:val="0"/>
+                <w:sz w:val="18"/>
+              </w:rPr>
+              <w:t>Se valida bloqueo de cierre cuando la matriz requiere plan de acción pendiente.</w:t>
             </w:r>
           </w:p>
         </w:tc>
@@ -683,11 +810,7 @@
         <w:pStyle w:val="Heading1"/>
       </w:pPr>
       <w:r>
-        <w:rPr>
-          <w:rFonts w:ascii="Calibri" w:hAnsi="Calibri"/>
-          <w:color w:val="2E74B5"/>
-        </w:rPr>
-        <w:t>4. Reglas de Negocio</w:t>
+        <w:t>4. Validación funcional API</w:t>
       </w:r>
     </w:p>
     <w:tbl>
@@ -698,51 +821,43 @@
         <w:tblLook w:firstColumn="1" w:firstRow="1" w:lastColumn="0" w:lastRow="0" w:noHBand="0" w:noVBand="1" w:val="04A0"/>
       </w:tblPr>
       <w:tblGrid>
-        <w:gridCol w:w="4680"/>
-        <w:gridCol w:w="4680"/>
+        <w:gridCol w:w="5112"/>
+        <w:gridCol w:w="5112"/>
       </w:tblGrid>
       <w:tr>
         <w:tc>
           <w:tcPr>
-            <w:tcW w:type="dxa" w:w="2592"/>
-            <w:shd w:fill="E8EEF5"/>
+            <w:tcW w:type="dxa" w:w="6624"/>
             <w:vAlign w:val="center"/>
+            <w:shd w:fill="1F3F8D"/>
           </w:tcPr>
           <w:p>
-            <w:pPr>
-              <w:spacing w:after="0"/>
-            </w:pPr>
             <w:r/>
             <w:r>
               <w:rPr>
-                <w:rFonts w:ascii="Calibri" w:hAnsi="Calibri"/>
                 <w:b/>
-                <w:color w:val="0B2545"/>
+                <w:color w:val="FFFFFF"/>
                 <w:sz w:val="18"/>
               </w:rPr>
-              <w:t>Regla</w:t>
+              <w:t>Prueba</w:t>
             </w:r>
           </w:p>
         </w:tc>
         <w:tc>
           <w:tcPr>
-            <w:tcW w:type="dxa" w:w="6624"/>
-            <w:shd w:fill="E8EEF5"/>
+            <w:tcW w:type="dxa" w:w="3456"/>
             <w:vAlign w:val="center"/>
+            <w:shd w:fill="1F3F8D"/>
           </w:tcPr>
           <w:p>
-            <w:pPr>
-              <w:spacing w:after="0"/>
-            </w:pPr>
             <w:r/>
             <w:r>
               <w:rPr>
-                <w:rFonts w:ascii="Calibri" w:hAnsi="Calibri"/>
                 <w:b/>
-                <w:color w:val="0B2545"/>
+                <w:color w:val="FFFFFF"/>
                 <w:sz w:val="18"/>
               </w:rPr>
-              <w:t>Aplicación</w:t>
+              <w:t>Resultado</w:t>
             </w:r>
           </w:p>
         </w:tc>
@@ -750,41 +865,33 @@
       <w:tr>
         <w:tc>
           <w:tcPr>
-            <w:tcW w:type="dxa" w:w="2592"/>
+            <w:tcW w:type="dxa" w:w="6624"/>
             <w:vAlign w:val="center"/>
           </w:tcPr>
           <w:p>
-            <w:pPr>
-              <w:spacing w:after="0"/>
-            </w:pPr>
             <w:r/>
             <w:r>
               <w:rPr>
-                <w:rFonts w:ascii="Calibri" w:hAnsi="Calibri"/>
                 <w:b w:val="0"/>
                 <w:sz w:val="18"/>
               </w:rPr>
-              <w:t>Planes obligatorios</w:t>
+              <w:t>Listar planes de matriz</w:t>
             </w:r>
           </w:p>
         </w:tc>
         <w:tc>
           <w:tcPr>
-            <w:tcW w:type="dxa" w:w="6624"/>
+            <w:tcW w:type="dxa" w:w="3456"/>
             <w:vAlign w:val="center"/>
           </w:tcPr>
           <w:p>
-            <w:pPr>
-              <w:spacing w:after="0"/>
-            </w:pPr>
             <w:r/>
             <w:r>
               <w:rPr>
-                <w:rFonts w:ascii="Calibri" w:hAnsi="Calibri"/>
                 <w:b w:val="0"/>
                 <w:sz w:val="18"/>
               </w:rPr>
-              <w:t>Toda matriz con residual Alto o Crítico debe contar con plan de acción o tratamiento aprobado antes del cierre.</w:t>
+              <w:t>Correcto</w:t>
             </w:r>
           </w:p>
         </w:tc>
@@ -792,41 +899,33 @@
       <w:tr>
         <w:tc>
           <w:tcPr>
-            <w:tcW w:type="dxa" w:w="2592"/>
+            <w:tcW w:type="dxa" w:w="6624"/>
             <w:vAlign w:val="center"/>
           </w:tcPr>
           <w:p>
-            <w:pPr>
-              <w:spacing w:after="0"/>
-            </w:pPr>
             <w:r/>
             <w:r>
               <w:rPr>
-                <w:rFonts w:ascii="Calibri" w:hAnsi="Calibri"/>
                 <w:b w:val="0"/>
                 <w:sz w:val="18"/>
               </w:rPr>
-              <w:t>Bloqueo de cierre</w:t>
+              <w:t>Bloquear cierre de matriz con plan requerido pendiente</w:t>
             </w:r>
           </w:p>
         </w:tc>
         <w:tc>
           <w:tcPr>
-            <w:tcW w:type="dxa" w:w="6624"/>
+            <w:tcW w:type="dxa" w:w="3456"/>
             <w:vAlign w:val="center"/>
           </w:tcPr>
           <w:p>
-            <w:pPr>
-              <w:spacing w:after="0"/>
-            </w:pPr>
             <w:r/>
             <w:r>
               <w:rPr>
-                <w:rFonts w:ascii="Calibri" w:hAnsi="Calibri"/>
                 <w:b w:val="0"/>
                 <w:sz w:val="18"/>
               </w:rPr>
-              <w:t>El backend impide pasar una matriz a CERRADA si requiere plan y no existe plan cerrado con motivo registrado.</w:t>
+              <w:t>Correcto</w:t>
             </w:r>
           </w:p>
         </w:tc>
@@ -834,41 +933,33 @@
       <w:tr>
         <w:tc>
           <w:tcPr>
-            <w:tcW w:type="dxa" w:w="2592"/>
+            <w:tcW w:type="dxa" w:w="6624"/>
             <w:vAlign w:val="center"/>
           </w:tcPr>
           <w:p>
-            <w:pPr>
-              <w:spacing w:after="0"/>
-            </w:pPr>
             <w:r/>
             <w:r>
               <w:rPr>
-                <w:rFonts w:ascii="Calibri" w:hAnsi="Calibri"/>
                 <w:b w:val="0"/>
                 <w:sz w:val="18"/>
               </w:rPr>
-              <w:t>Matrices cerradas o inactivas</w:t>
+              <w:t>Crear plan de acción</w:t>
             </w:r>
           </w:p>
         </w:tc>
         <w:tc>
           <w:tcPr>
-            <w:tcW w:type="dxa" w:w="6624"/>
+            <w:tcW w:type="dxa" w:w="3456"/>
             <w:vAlign w:val="center"/>
           </w:tcPr>
           <w:p>
-            <w:pPr>
-              <w:spacing w:after="0"/>
-            </w:pPr>
             <w:r/>
             <w:r>
               <w:rPr>
-                <w:rFonts w:ascii="Calibri" w:hAnsi="Calibri"/>
                 <w:b w:val="0"/>
                 <w:sz w:val="18"/>
               </w:rPr>
-              <w:t>No permiten creación/edición de planes ni carga de evidencias nuevas.</w:t>
+              <w:t>Correcto</w:t>
             </w:r>
           </w:p>
         </w:tc>
@@ -876,41 +967,33 @@
       <w:tr>
         <w:tc>
           <w:tcPr>
-            <w:tcW w:type="dxa" w:w="2592"/>
+            <w:tcW w:type="dxa" w:w="6624"/>
             <w:vAlign w:val="center"/>
           </w:tcPr>
           <w:p>
-            <w:pPr>
-              <w:spacing w:after="0"/>
-            </w:pPr>
             <w:r/>
             <w:r>
               <w:rPr>
-                <w:rFonts w:ascii="Calibri" w:hAnsi="Calibri"/>
                 <w:b w:val="0"/>
                 <w:sz w:val="18"/>
               </w:rPr>
-              <w:t>Motivo obligatorio</w:t>
+              <w:t>Editar plan de acción</w:t>
             </w:r>
           </w:p>
         </w:tc>
         <w:tc>
           <w:tcPr>
-            <w:tcW w:type="dxa" w:w="6624"/>
+            <w:tcW w:type="dxa" w:w="3456"/>
             <w:vAlign w:val="center"/>
           </w:tcPr>
           <w:p>
-            <w:pPr>
-              <w:spacing w:after="0"/>
-            </w:pPr>
             <w:r/>
             <w:r>
               <w:rPr>
-                <w:rFonts w:ascii="Calibri" w:hAnsi="Calibri"/>
                 <w:b w:val="0"/>
                 <w:sz w:val="18"/>
               </w:rPr>
-              <w:t>Cambios de estado de planes, inactivaciones de planes e inactivaciones de evidencias requieren motivo.</w:t>
+              <w:t>Correcto</w:t>
             </w:r>
           </w:p>
         </w:tc>
@@ -918,41 +1001,33 @@
       <w:tr>
         <w:tc>
           <w:tcPr>
-            <w:tcW w:type="dxa" w:w="2592"/>
+            <w:tcW w:type="dxa" w:w="6624"/>
             <w:vAlign w:val="center"/>
           </w:tcPr>
           <w:p>
-            <w:pPr>
-              <w:spacing w:after="0"/>
-            </w:pPr>
             <w:r/>
             <w:r>
               <w:rPr>
-                <w:rFonts w:ascii="Calibri" w:hAnsi="Calibri"/>
                 <w:b w:val="0"/>
                 <w:sz w:val="18"/>
               </w:rPr>
-              <w:t>No duplicidad de planes</w:t>
+              <w:t>Cambiar estado de plan</w:t>
             </w:r>
           </w:p>
         </w:tc>
         <w:tc>
           <w:tcPr>
-            <w:tcW w:type="dxa" w:w="6624"/>
+            <w:tcW w:type="dxa" w:w="3456"/>
             <w:vAlign w:val="center"/>
           </w:tcPr>
           <w:p>
-            <w:pPr>
-              <w:spacing w:after="0"/>
-            </w:pPr>
             <w:r/>
             <w:r>
               <w:rPr>
-                <w:rFonts w:ascii="Calibri" w:hAnsi="Calibri"/>
                 <w:b w:val="0"/>
                 <w:sz w:val="18"/>
               </w:rPr>
-              <w:t>No se permite duplicar un plan activo con la misma actividad y responsable dentro de la misma matriz.</w:t>
+              <w:t>Correcto</w:t>
             </w:r>
           </w:p>
         </w:tc>
@@ -960,41 +1035,33 @@
       <w:tr>
         <w:tc>
           <w:tcPr>
-            <w:tcW w:type="dxa" w:w="2592"/>
+            <w:tcW w:type="dxa" w:w="6624"/>
             <w:vAlign w:val="center"/>
           </w:tcPr>
           <w:p>
-            <w:pPr>
-              <w:spacing w:after="0"/>
-            </w:pPr>
             <w:r/>
             <w:r>
               <w:rPr>
-                <w:rFonts w:ascii="Calibri" w:hAnsi="Calibri"/>
                 <w:b w:val="0"/>
                 <w:sz w:val="18"/>
               </w:rPr>
-              <w:t>Pertenencia estricta</w:t>
+              <w:t>Inactivar plan con motivo obligatorio</w:t>
             </w:r>
           </w:p>
         </w:tc>
         <w:tc>
           <w:tcPr>
-            <w:tcW w:type="dxa" w:w="6624"/>
+            <w:tcW w:type="dxa" w:w="3456"/>
             <w:vAlign w:val="center"/>
           </w:tcPr>
           <w:p>
-            <w:pPr>
-              <w:spacing w:after="0"/>
-            </w:pPr>
             <w:r/>
             <w:r>
               <w:rPr>
-                <w:rFonts w:ascii="Calibri" w:hAnsi="Calibri"/>
                 <w:b w:val="0"/>
                 <w:sz w:val="18"/>
               </w:rPr>
-              <w:t>Resultado, control y plan deben pertenecer a la matriz antes de ser vinculados.</w:t>
+              <w:t>Correcto</w:t>
             </w:r>
           </w:p>
         </w:tc>
@@ -1002,41 +1069,203 @@
       <w:tr>
         <w:tc>
           <w:tcPr>
-            <w:tcW w:type="dxa" w:w="2592"/>
+            <w:tcW w:type="dxa" w:w="6624"/>
             <w:vAlign w:val="center"/>
           </w:tcPr>
           <w:p>
-            <w:pPr>
-              <w:spacing w:after="0"/>
-            </w:pPr>
             <w:r/>
             <w:r>
               <w:rPr>
-                <w:rFonts w:ascii="Calibri" w:hAnsi="Calibri"/>
                 <w:b w:val="0"/>
                 <w:sz w:val="18"/>
               </w:rPr>
-              <w:t>Archivo protegido</w:t>
+              <w:t>Reactivar plan con motivo obligatorio</w:t>
             </w:r>
           </w:p>
         </w:tc>
+        <w:tc>
+          <w:tcPr>
+            <w:tcW w:type="dxa" w:w="3456"/>
+            <w:vAlign w:val="center"/>
+          </w:tcPr>
+          <w:p>
+            <w:r/>
+            <w:r>
+              <w:rPr>
+                <w:b w:val="0"/>
+                <w:sz w:val="18"/>
+              </w:rPr>
+              <w:t>Correcto</w:t>
+            </w:r>
+          </w:p>
+        </w:tc>
+      </w:tr>
+      <w:tr>
         <w:tc>
           <w:tcPr>
             <w:tcW w:type="dxa" w:w="6624"/>
             <w:vAlign w:val="center"/>
           </w:tcPr>
           <w:p>
-            <w:pPr>
-              <w:spacing w:after="0"/>
-            </w:pPr>
             <w:r/>
             <w:r>
               <w:rPr>
-                <w:rFonts w:ascii="Calibri" w:hAnsi="Calibri"/>
                 <w:b w:val="0"/>
                 <w:sz w:val="18"/>
               </w:rPr>
-              <w:t>La evidencia se guarda con nombre físico GUID, metadatos, hash SHA-256 y ruta no pública.</w:t>
+              <w:t>Cargar evidencia documental</w:t>
+            </w:r>
+          </w:p>
+        </w:tc>
+        <w:tc>
+          <w:tcPr>
+            <w:tcW w:type="dxa" w:w="3456"/>
+            <w:vAlign w:val="center"/>
+          </w:tcPr>
+          <w:p>
+            <w:r/>
+            <w:r>
+              <w:rPr>
+                <w:b w:val="0"/>
+                <w:sz w:val="18"/>
+              </w:rPr>
+              <w:t>Correcto</w:t>
+            </w:r>
+          </w:p>
+        </w:tc>
+      </w:tr>
+      <w:tr>
+        <w:tc>
+          <w:tcPr>
+            <w:tcW w:type="dxa" w:w="6624"/>
+            <w:vAlign w:val="center"/>
+          </w:tcPr>
+          <w:p>
+            <w:r/>
+            <w:r>
+              <w:rPr>
+                <w:b w:val="0"/>
+                <w:sz w:val="18"/>
+              </w:rPr>
+              <w:t>Listar evidencias activas</w:t>
+            </w:r>
+          </w:p>
+        </w:tc>
+        <w:tc>
+          <w:tcPr>
+            <w:tcW w:type="dxa" w:w="3456"/>
+            <w:vAlign w:val="center"/>
+          </w:tcPr>
+          <w:p>
+            <w:r/>
+            <w:r>
+              <w:rPr>
+                <w:b w:val="0"/>
+                <w:sz w:val="18"/>
+              </w:rPr>
+              <w:t>Correcto</w:t>
+            </w:r>
+          </w:p>
+        </w:tc>
+      </w:tr>
+      <w:tr>
+        <w:tc>
+          <w:tcPr>
+            <w:tcW w:type="dxa" w:w="6624"/>
+            <w:vAlign w:val="center"/>
+          </w:tcPr>
+          <w:p>
+            <w:r/>
+            <w:r>
+              <w:rPr>
+                <w:b w:val="0"/>
+                <w:sz w:val="18"/>
+              </w:rPr>
+              <w:t>Descargar evidencia</w:t>
+            </w:r>
+          </w:p>
+        </w:tc>
+        <w:tc>
+          <w:tcPr>
+            <w:tcW w:type="dxa" w:w="3456"/>
+            <w:vAlign w:val="center"/>
+          </w:tcPr>
+          <w:p>
+            <w:r/>
+            <w:r>
+              <w:rPr>
+                <w:b w:val="0"/>
+                <w:sz w:val="18"/>
+              </w:rPr>
+              <w:t>Correcto</w:t>
+            </w:r>
+          </w:p>
+        </w:tc>
+      </w:tr>
+      <w:tr>
+        <w:tc>
+          <w:tcPr>
+            <w:tcW w:type="dxa" w:w="6624"/>
+            <w:vAlign w:val="center"/>
+          </w:tcPr>
+          <w:p>
+            <w:r/>
+            <w:r>
+              <w:rPr>
+                <w:b w:val="0"/>
+                <w:sz w:val="18"/>
+              </w:rPr>
+              <w:t>Inactivar evidencia con motivo obligatorio</w:t>
+            </w:r>
+          </w:p>
+        </w:tc>
+        <w:tc>
+          <w:tcPr>
+            <w:tcW w:type="dxa" w:w="3456"/>
+            <w:vAlign w:val="center"/>
+          </w:tcPr>
+          <w:p>
+            <w:r/>
+            <w:r>
+              <w:rPr>
+                <w:b w:val="0"/>
+                <w:sz w:val="18"/>
+              </w:rPr>
+              <w:t>Correcto</w:t>
+            </w:r>
+          </w:p>
+        </w:tc>
+      </w:tr>
+      <w:tr>
+        <w:tc>
+          <w:tcPr>
+            <w:tcW w:type="dxa" w:w="6624"/>
+            <w:vAlign w:val="center"/>
+          </w:tcPr>
+          <w:p>
+            <w:r/>
+            <w:r>
+              <w:rPr>
+                <w:b w:val="0"/>
+                <w:sz w:val="18"/>
+              </w:rPr>
+              <w:t>Consultar historial funcional</w:t>
+            </w:r>
+          </w:p>
+        </w:tc>
+        <w:tc>
+          <w:tcPr>
+            <w:tcW w:type="dxa" w:w="3456"/>
+            <w:vAlign w:val="center"/>
+          </w:tcPr>
+          <w:p>
+            <w:r/>
+            <w:r>
+              <w:rPr>
+                <w:b w:val="0"/>
+                <w:sz w:val="18"/>
+              </w:rPr>
+              <w:t>Correcto</w:t>
             </w:r>
           </w:p>
         </w:tc>
@@ -1048,11 +1277,7 @@
         <w:pStyle w:val="Heading1"/>
       </w:pPr>
       <w:r>
-        <w:rPr>
-          <w:rFonts w:ascii="Calibri" w:hAnsi="Calibri"/>
-          <w:color w:val="2E74B5"/>
-        </w:rPr>
-        <w:t>5. Backend Implementado</w:t>
+        <w:t>5. Evidencia DBA y auditoría</w:t>
       </w:r>
     </w:p>
     <w:tbl>
@@ -1063,51 +1288,43 @@
         <w:tblLook w:firstColumn="1" w:firstRow="1" w:lastColumn="0" w:lastRow="0" w:noHBand="0" w:noVBand="1" w:val="04A0"/>
       </w:tblPr>
       <w:tblGrid>
-        <w:gridCol w:w="4680"/>
-        <w:gridCol w:w="4680"/>
+        <w:gridCol w:w="5112"/>
+        <w:gridCol w:w="5112"/>
       </w:tblGrid>
       <w:tr>
         <w:tc>
           <w:tcPr>
-            <w:tcW w:type="dxa" w:w="2592"/>
-            <w:shd w:fill="E8EEF5"/>
+            <w:tcW w:type="dxa" w:w="3312"/>
             <w:vAlign w:val="center"/>
+            <w:shd w:fill="1F3F8D"/>
           </w:tcPr>
           <w:p>
-            <w:pPr>
-              <w:spacing w:after="0"/>
-            </w:pPr>
             <w:r/>
             <w:r>
               <w:rPr>
-                <w:rFonts w:ascii="Calibri" w:hAnsi="Calibri"/>
                 <w:b/>
-                <w:color w:val="0B2545"/>
+                <w:color w:val="FFFFFF"/>
                 <w:sz w:val="18"/>
               </w:rPr>
-              <w:t>Componente</w:t>
+              <w:t>Elemento</w:t>
             </w:r>
           </w:p>
         </w:tc>
         <w:tc>
           <w:tcPr>
-            <w:tcW w:type="dxa" w:w="6624"/>
-            <w:shd w:fill="E8EEF5"/>
+            <w:tcW w:type="dxa" w:w="7344"/>
             <w:vAlign w:val="center"/>
+            <w:shd w:fill="1F3F8D"/>
           </w:tcPr>
           <w:p>
-            <w:pPr>
-              <w:spacing w:after="0"/>
-            </w:pPr>
             <w:r/>
             <w:r>
               <w:rPr>
-                <w:rFonts w:ascii="Calibri" w:hAnsi="Calibri"/>
                 <w:b/>
-                <w:color w:val="0B2545"/>
+                <w:color w:val="FFFFFF"/>
                 <w:sz w:val="18"/>
               </w:rPr>
-              <w:t>Implementación</w:t>
+              <w:t>Resultado</w:t>
             </w:r>
           </w:p>
         </w:tc>
@@ -1115,41 +1332,33 @@
       <w:tr>
         <w:tc>
           <w:tcPr>
-            <w:tcW w:type="dxa" w:w="2592"/>
+            <w:tcW w:type="dxa" w:w="3312"/>
             <w:vAlign w:val="center"/>
           </w:tcPr>
           <w:p>
-            <w:pPr>
-              <w:spacing w:after="0"/>
-            </w:pPr>
             <w:r/>
             <w:r>
               <w:rPr>
-                <w:rFonts w:ascii="Calibri" w:hAnsi="Calibri"/>
                 <w:b w:val="0"/>
                 <w:sz w:val="18"/>
               </w:rPr>
-              <w:t>Controller</w:t>
+              <w:t>Matriz utilizada</w:t>
             </w:r>
           </w:p>
         </w:tc>
         <w:tc>
           <w:tcPr>
-            <w:tcW w:type="dxa" w:w="6624"/>
+            <w:tcW w:type="dxa" w:w="7344"/>
             <w:vAlign w:val="center"/>
           </w:tcPr>
           <w:p>
-            <w:pPr>
-              <w:spacing w:after="0"/>
-            </w:pPr>
             <w:r/>
             <w:r>
               <w:rPr>
-                <w:rFonts w:ascii="Calibri" w:hAnsi="Calibri"/>
                 <w:b w:val="0"/>
                 <w:sz w:val="18"/>
               </w:rPr>
-              <w:t>Nuevos endpoints REST en MatricesRiesgosController para planes y evidencias.</w:t>
+              <w:t>MRMAT_ID 6, estado inicial CALCULADA, nivel residual Alto.</w:t>
             </w:r>
           </w:p>
         </w:tc>
@@ -1157,41 +1366,33 @@
       <w:tr>
         <w:tc>
           <w:tcPr>
-            <w:tcW w:type="dxa" w:w="2592"/>
+            <w:tcW w:type="dxa" w:w="3312"/>
             <w:vAlign w:val="center"/>
           </w:tcPr>
           <w:p>
-            <w:pPr>
-              <w:spacing w:after="0"/>
-            </w:pPr>
             <w:r/>
             <w:r>
               <w:rPr>
-                <w:rFonts w:ascii="Calibri" w:hAnsi="Calibri"/>
                 <w:b w:val="0"/>
                 <w:sz w:val="18"/>
               </w:rPr>
-              <w:t>Application Service</w:t>
+              <w:t>Plan de prueba</w:t>
             </w:r>
           </w:p>
         </w:tc>
         <w:tc>
           <w:tcPr>
-            <w:tcW w:type="dxa" w:w="6624"/>
+            <w:tcW w:type="dxa" w:w="7344"/>
             <w:vAlign w:val="center"/>
           </w:tcPr>
           <w:p>
-            <w:pPr>
-              <w:spacing w:after="0"/>
-            </w:pPr>
             <w:r/>
             <w:r>
               <w:rPr>
-                <w:rFonts w:ascii="Calibri" w:hAnsi="Calibri"/>
                 <w:b w:val="0"/>
                 <w:sz w:val="18"/>
               </w:rPr>
-              <w:t>Validación de estados, motivos, tamaño, extensión, MIME, hash, almacenamiento físico y descarga auditada.</w:t>
+              <w:t>MRP_ID 2 utilizado para flujo de creación, edición, cambio de estado, inactivación y reactivación.</w:t>
             </w:r>
           </w:p>
         </w:tc>
@@ -1199,41 +1400,33 @@
       <w:tr>
         <w:tc>
           <w:tcPr>
-            <w:tcW w:type="dxa" w:w="2592"/>
+            <w:tcW w:type="dxa" w:w="3312"/>
             <w:vAlign w:val="center"/>
           </w:tcPr>
           <w:p>
-            <w:pPr>
-              <w:spacing w:after="0"/>
-            </w:pPr>
             <w:r/>
             <w:r>
               <w:rPr>
-                <w:rFonts w:ascii="Calibri" w:hAnsi="Calibri"/>
                 <w:b w:val="0"/>
                 <w:sz w:val="18"/>
               </w:rPr>
-              <w:t>Repository Oracle</w:t>
+              <w:t>Evidencia de prueba</w:t>
             </w:r>
           </w:p>
         </w:tc>
         <w:tc>
           <w:tcPr>
-            <w:tcW w:type="dxa" w:w="6624"/>
+            <w:tcW w:type="dxa" w:w="7344"/>
             <w:vAlign w:val="center"/>
           </w:tcPr>
           <w:p>
-            <w:pPr>
-              <w:spacing w:after="0"/>
-            </w:pPr>
             <w:r/>
             <w:r>
               <w:rPr>
-                <w:rFonts w:ascii="Calibri" w:hAnsi="Calibri"/>
                 <w:b w:val="0"/>
                 <w:sz w:val="18"/>
               </w:rPr>
-              <w:t>Persistencia transaccional en RL_MR_PLANES_ACCION y RL_MR_EVIDENCIAS con historial y auditoría.</w:t>
+              <w:t>MRE_ID 5 utilizado para flujo de carga, descarga e inactivación lógica.</w:t>
             </w:r>
           </w:p>
         </w:tc>
@@ -1241,41 +1434,67 @@
       <w:tr>
         <w:tc>
           <w:tcPr>
-            <w:tcW w:type="dxa" w:w="2592"/>
+            <w:tcW w:type="dxa" w:w="3312"/>
             <w:vAlign w:val="center"/>
           </w:tcPr>
           <w:p>
-            <w:pPr>
-              <w:spacing w:after="0"/>
-            </w:pPr>
             <w:r/>
             <w:r>
               <w:rPr>
-                <w:rFonts w:ascii="Calibri" w:hAnsi="Calibri"/>
                 <w:b w:val="0"/>
                 <w:sz w:val="18"/>
               </w:rPr>
-              <w:t>DTOs</w:t>
+              <w:t>Auditoría de planes</w:t>
             </w:r>
           </w:p>
         </w:tc>
         <w:tc>
           <w:tcPr>
-            <w:tcW w:type="dxa" w:w="6624"/>
+            <w:tcW w:type="dxa" w:w="7344"/>
             <w:vAlign w:val="center"/>
           </w:tcPr>
           <w:p>
-            <w:pPr>
-              <w:spacing w:after="0"/>
-            </w:pPr>
             <w:r/>
             <w:r>
               <w:rPr>
-                <w:rFonts w:ascii="Calibri" w:hAnsi="Calibri"/>
                 <w:b w:val="0"/>
                 <w:sz w:val="18"/>
               </w:rPr>
-              <w:t>Contratos para plan de acción, cambio de estado, evidencia, carga y descarga documental.</w:t>
+              <w:t>13 registros detectados para RL_MR_PLANES_ACCION.</w:t>
+            </w:r>
+          </w:p>
+        </w:tc>
+      </w:tr>
+      <w:tr>
+        <w:tc>
+          <w:tcPr>
+            <w:tcW w:type="dxa" w:w="3312"/>
+            <w:vAlign w:val="center"/>
+          </w:tcPr>
+          <w:p>
+            <w:r/>
+            <w:r>
+              <w:rPr>
+                <w:b w:val="0"/>
+                <w:sz w:val="18"/>
+              </w:rPr>
+              <w:t>Auditoría de evidencias</w:t>
+            </w:r>
+          </w:p>
+        </w:tc>
+        <w:tc>
+          <w:tcPr>
+            <w:tcW w:type="dxa" w:w="7344"/>
+            <w:vAlign w:val="center"/>
+          </w:tcPr>
+          <w:p>
+            <w:r/>
+            <w:r>
+              <w:rPr>
+                <w:b w:val="0"/>
+                <w:sz w:val="18"/>
+              </w:rPr>
+              <w:t>24 registros detectados para RL_MR_EVIDENCIAS.</w:t>
             </w:r>
           </w:p>
         </w:tc>
@@ -1287,11 +1506,20 @@
         <w:pStyle w:val="Heading1"/>
       </w:pPr>
       <w:r>
-        <w:rPr>
-          <w:rFonts w:ascii="Calibri" w:hAnsi="Calibri"/>
-          <w:color w:val="2E74B5"/>
-        </w:rPr>
-        <w:t>6. Endpoints Principales</w:t>
+        <w:t>6. Separación de módulos confirmada</w:t>
+      </w:r>
+    </w:p>
+    <w:p>
+      <w:r>
+        <w:t>La validación técnica confirma que Fase 10 no crea dependencia funcional con Monitoreo de Listas, no habilita escritura hacia DNP, no utiliza CONTROL_ALMACEN.PROVEEDOR y no modifica la política institucional de permisos por módulo.</w:t>
+      </w:r>
+    </w:p>
+    <w:p>
+      <w:pPr>
+        <w:pStyle w:val="Heading1"/>
+      </w:pPr>
+      <w:r>
+        <w:t>7. Validación de compilación</w:t>
       </w:r>
     </w:p>
     <w:tbl>
@@ -1302,74 +1530,43 @@
         <w:tblLook w:firstColumn="1" w:firstRow="1" w:lastColumn="0" w:lastRow="0" w:noHBand="0" w:noVBand="1" w:val="04A0"/>
       </w:tblPr>
       <w:tblGrid>
-        <w:gridCol w:w="3120"/>
-        <w:gridCol w:w="3120"/>
-        <w:gridCol w:w="3120"/>
+        <w:gridCol w:w="5112"/>
+        <w:gridCol w:w="5112"/>
       </w:tblGrid>
       <w:tr>
         <w:tc>
           <w:tcPr>
-            <w:tcW w:type="dxa" w:w="1008"/>
-            <w:shd w:fill="E8EEF5"/>
+            <w:tcW w:type="dxa" w:w="3456"/>
             <w:vAlign w:val="center"/>
+            <w:shd w:fill="1F3F8D"/>
           </w:tcPr>
           <w:p>
-            <w:pPr>
-              <w:spacing w:after="0"/>
-            </w:pPr>
             <w:r/>
             <w:r>
               <w:rPr>
-                <w:rFonts w:ascii="Calibri" w:hAnsi="Calibri"/>
                 <w:b/>
-                <w:color w:val="0B2545"/>
+                <w:color w:val="FFFFFF"/>
                 <w:sz w:val="18"/>
               </w:rPr>
-              <w:t>Método</w:t>
+              <w:t>Ambiente</w:t>
             </w:r>
           </w:p>
         </w:tc>
         <w:tc>
           <w:tcPr>
-            <w:tcW w:type="dxa" w:w="4032"/>
-            <w:shd w:fill="E8EEF5"/>
+            <w:tcW w:type="dxa" w:w="6912"/>
             <w:vAlign w:val="center"/>
+            <w:shd w:fill="1F3F8D"/>
           </w:tcPr>
           <w:p>
-            <w:pPr>
-              <w:spacing w:after="0"/>
-            </w:pPr>
             <w:r/>
             <w:r>
               <w:rPr>
-                <w:rFonts w:ascii="Calibri" w:hAnsi="Calibri"/>
                 <w:b/>
-                <w:color w:val="0B2545"/>
+                <w:color w:val="FFFFFF"/>
                 <w:sz w:val="18"/>
               </w:rPr>
-              <w:t>Ruta</w:t>
-            </w:r>
-          </w:p>
-        </w:tc>
-        <w:tc>
-          <w:tcPr>
-            <w:tcW w:type="dxa" w:w="4176"/>
-            <w:shd w:fill="E8EEF5"/>
-            <w:vAlign w:val="center"/>
-          </w:tcPr>
-          <w:p>
-            <w:pPr>
-              <w:spacing w:after="0"/>
-            </w:pPr>
-            <w:r/>
-            <w:r>
-              <w:rPr>
-                <w:rFonts w:ascii="Calibri" w:hAnsi="Calibri"/>
-                <w:b/>
-                <w:color w:val="0B2545"/>
-                <w:sz w:val="18"/>
-              </w:rPr>
-              <w:t>Propósito</w:t>
+              <w:t>Resultado</w:t>
             </w:r>
           </w:p>
         </w:tc>
@@ -1377,61 +1574,33 @@
       <w:tr>
         <w:tc>
           <w:tcPr>
-            <w:tcW w:type="dxa" w:w="1008"/>
+            <w:tcW w:type="dxa" w:w="3456"/>
             <w:vAlign w:val="center"/>
           </w:tcPr>
           <w:p>
-            <w:pPr>
-              <w:spacing w:after="0"/>
-            </w:pPr>
             <w:r/>
             <w:r>
               <w:rPr>
-                <w:rFonts w:ascii="Calibri" w:hAnsi="Calibri"/>
                 <w:b w:val="0"/>
                 <w:sz w:val="18"/>
               </w:rPr>
-              <w:t>GET</w:t>
+              <w:t>Backend .NET</w:t>
             </w:r>
           </w:p>
         </w:tc>
         <w:tc>
           <w:tcPr>
-            <w:tcW w:type="dxa" w:w="4032"/>
+            <w:tcW w:type="dxa" w:w="6912"/>
             <w:vAlign w:val="center"/>
           </w:tcPr>
           <w:p>
-            <w:pPr>
-              <w:spacing w:after="0"/>
-            </w:pPr>
             <w:r/>
             <w:r>
               <w:rPr>
-                <w:rFonts w:ascii="Calibri" w:hAnsi="Calibri"/>
                 <w:b w:val="0"/>
                 <w:sz w:val="18"/>
               </w:rPr>
-              <w:t>/api/matrices-riesgos/{id}/planes</w:t>
-            </w:r>
-          </w:p>
-        </w:tc>
-        <w:tc>
-          <w:tcPr>
-            <w:tcW w:type="dxa" w:w="4176"/>
-            <w:vAlign w:val="center"/>
-          </w:tcPr>
-          <w:p>
-            <w:pPr>
-              <w:spacing w:after="0"/>
-            </w:pPr>
-            <w:r/>
-            <w:r>
-              <w:rPr>
-                <w:rFonts w:ascii="Calibri" w:hAnsi="Calibri"/>
-                <w:b w:val="0"/>
-                <w:sz w:val="18"/>
-              </w:rPr>
-              <w:t>Consultar planes de acción de la matriz.</w:t>
+              <w:t>Compilación correcta, 0 errores y 0 advertencias.</w:t>
             </w:r>
           </w:p>
         </w:tc>
@@ -1439,495 +1608,33 @@
       <w:tr>
         <w:tc>
           <w:tcPr>
-            <w:tcW w:type="dxa" w:w="1008"/>
+            <w:tcW w:type="dxa" w:w="3456"/>
             <w:vAlign w:val="center"/>
           </w:tcPr>
           <w:p>
-            <w:pPr>
-              <w:spacing w:after="0"/>
-            </w:pPr>
             <w:r/>
             <w:r>
               <w:rPr>
-                <w:rFonts w:ascii="Calibri" w:hAnsi="Calibri"/>
                 <w:b w:val="0"/>
                 <w:sz w:val="18"/>
               </w:rPr>
-              <w:t>POST</w:t>
+              <w:t>Frontend Angular</w:t>
             </w:r>
           </w:p>
         </w:tc>
         <w:tc>
           <w:tcPr>
-            <w:tcW w:type="dxa" w:w="4032"/>
+            <w:tcW w:type="dxa" w:w="6912"/>
             <w:vAlign w:val="center"/>
           </w:tcPr>
           <w:p>
-            <w:pPr>
-              <w:spacing w:after="0"/>
-            </w:pPr>
             <w:r/>
             <w:r>
               <w:rPr>
-                <w:rFonts w:ascii="Calibri" w:hAnsi="Calibri"/>
                 <w:b w:val="0"/>
                 <w:sz w:val="18"/>
               </w:rPr>
-              <w:t>/api/matrices-riesgos/{id}/planes</w:t>
-            </w:r>
-          </w:p>
-        </w:tc>
-        <w:tc>
-          <w:tcPr>
-            <w:tcW w:type="dxa" w:w="4176"/>
-            <w:vAlign w:val="center"/>
-          </w:tcPr>
-          <w:p>
-            <w:pPr>
-              <w:spacing w:after="0"/>
-            </w:pPr>
-            <w:r/>
-            <w:r>
-              <w:rPr>
-                <w:rFonts w:ascii="Calibri" w:hAnsi="Calibri"/>
-                <w:b w:val="0"/>
-                <w:sz w:val="18"/>
-              </w:rPr>
-              <w:t>Crear plan de acción.</w:t>
-            </w:r>
-          </w:p>
-        </w:tc>
-      </w:tr>
-      <w:tr>
-        <w:tc>
-          <w:tcPr>
-            <w:tcW w:type="dxa" w:w="1008"/>
-            <w:vAlign w:val="center"/>
-          </w:tcPr>
-          <w:p>
-            <w:pPr>
-              <w:spacing w:after="0"/>
-            </w:pPr>
-            <w:r/>
-            <w:r>
-              <w:rPr>
-                <w:rFonts w:ascii="Calibri" w:hAnsi="Calibri"/>
-                <w:b w:val="0"/>
-                <w:sz w:val="18"/>
-              </w:rPr>
-              <w:t>PUT</w:t>
-            </w:r>
-          </w:p>
-        </w:tc>
-        <w:tc>
-          <w:tcPr>
-            <w:tcW w:type="dxa" w:w="4032"/>
-            <w:vAlign w:val="center"/>
-          </w:tcPr>
-          <w:p>
-            <w:pPr>
-              <w:spacing w:after="0"/>
-            </w:pPr>
-            <w:r/>
-            <w:r>
-              <w:rPr>
-                <w:rFonts w:ascii="Calibri" w:hAnsi="Calibri"/>
-                <w:b w:val="0"/>
-                <w:sz w:val="18"/>
-              </w:rPr>
-              <w:t>/api/matrices-riesgos/{id}/planes/{planId}</w:t>
-            </w:r>
-          </w:p>
-        </w:tc>
-        <w:tc>
-          <w:tcPr>
-            <w:tcW w:type="dxa" w:w="4176"/>
-            <w:vAlign w:val="center"/>
-          </w:tcPr>
-          <w:p>
-            <w:pPr>
-              <w:spacing w:after="0"/>
-            </w:pPr>
-            <w:r/>
-            <w:r>
-              <w:rPr>
-                <w:rFonts w:ascii="Calibri" w:hAnsi="Calibri"/>
-                <w:b w:val="0"/>
-                <w:sz w:val="18"/>
-              </w:rPr>
-              <w:t>Actualizar plan de acción.</w:t>
-            </w:r>
-          </w:p>
-        </w:tc>
-      </w:tr>
-      <w:tr>
-        <w:tc>
-          <w:tcPr>
-            <w:tcW w:type="dxa" w:w="1008"/>
-            <w:vAlign w:val="center"/>
-          </w:tcPr>
-          <w:p>
-            <w:pPr>
-              <w:spacing w:after="0"/>
-            </w:pPr>
-            <w:r/>
-            <w:r>
-              <w:rPr>
-                <w:rFonts w:ascii="Calibri" w:hAnsi="Calibri"/>
-                <w:b w:val="0"/>
-                <w:sz w:val="18"/>
-              </w:rPr>
-              <w:t>PUT</w:t>
-            </w:r>
-          </w:p>
-        </w:tc>
-        <w:tc>
-          <w:tcPr>
-            <w:tcW w:type="dxa" w:w="4032"/>
-            <w:vAlign w:val="center"/>
-          </w:tcPr>
-          <w:p>
-            <w:pPr>
-              <w:spacing w:after="0"/>
-            </w:pPr>
-            <w:r/>
-            <w:r>
-              <w:rPr>
-                <w:rFonts w:ascii="Calibri" w:hAnsi="Calibri"/>
-                <w:b w:val="0"/>
-                <w:sz w:val="18"/>
-              </w:rPr>
-              <w:t>/api/matrices-riesgos/{id}/planes/{planId}/estado</w:t>
-            </w:r>
-          </w:p>
-        </w:tc>
-        <w:tc>
-          <w:tcPr>
-            <w:tcW w:type="dxa" w:w="4176"/>
-            <w:vAlign w:val="center"/>
-          </w:tcPr>
-          <w:p>
-            <w:pPr>
-              <w:spacing w:after="0"/>
-            </w:pPr>
-            <w:r/>
-            <w:r>
-              <w:rPr>
-                <w:rFonts w:ascii="Calibri" w:hAnsi="Calibri"/>
-                <w:b w:val="0"/>
-                <w:sz w:val="18"/>
-              </w:rPr>
-              <w:t>Cambiar estado del plan con motivo obligatorio.</w:t>
-            </w:r>
-          </w:p>
-        </w:tc>
-      </w:tr>
-      <w:tr>
-        <w:tc>
-          <w:tcPr>
-            <w:tcW w:type="dxa" w:w="1008"/>
-            <w:vAlign w:val="center"/>
-          </w:tcPr>
-          <w:p>
-            <w:pPr>
-              <w:spacing w:after="0"/>
-            </w:pPr>
-            <w:r/>
-            <w:r>
-              <w:rPr>
-                <w:rFonts w:ascii="Calibri" w:hAnsi="Calibri"/>
-                <w:b w:val="0"/>
-                <w:sz w:val="18"/>
-              </w:rPr>
-              <w:t>PUT</w:t>
-            </w:r>
-          </w:p>
-        </w:tc>
-        <w:tc>
-          <w:tcPr>
-            <w:tcW w:type="dxa" w:w="4032"/>
-            <w:vAlign w:val="center"/>
-          </w:tcPr>
-          <w:p>
-            <w:pPr>
-              <w:spacing w:after="0"/>
-            </w:pPr>
-            <w:r/>
-            <w:r>
-              <w:rPr>
-                <w:rFonts w:ascii="Calibri" w:hAnsi="Calibri"/>
-                <w:b w:val="0"/>
-                <w:sz w:val="18"/>
-              </w:rPr>
-              <w:t>/api/matrices-riesgos/{id}/planes/{planId}/inactivar</w:t>
-            </w:r>
-          </w:p>
-        </w:tc>
-        <w:tc>
-          <w:tcPr>
-            <w:tcW w:type="dxa" w:w="4176"/>
-            <w:vAlign w:val="center"/>
-          </w:tcPr>
-          <w:p>
-            <w:pPr>
-              <w:spacing w:after="0"/>
-            </w:pPr>
-            <w:r/>
-            <w:r>
-              <w:rPr>
-                <w:rFonts w:ascii="Calibri" w:hAnsi="Calibri"/>
-                <w:b w:val="0"/>
-                <w:sz w:val="18"/>
-              </w:rPr>
-              <w:t>Inactivar plan con motivo obligatorio.</w:t>
-            </w:r>
-          </w:p>
-        </w:tc>
-      </w:tr>
-      <w:tr>
-        <w:tc>
-          <w:tcPr>
-            <w:tcW w:type="dxa" w:w="1008"/>
-            <w:vAlign w:val="center"/>
-          </w:tcPr>
-          <w:p>
-            <w:pPr>
-              <w:spacing w:after="0"/>
-            </w:pPr>
-            <w:r/>
-            <w:r>
-              <w:rPr>
-                <w:rFonts w:ascii="Calibri" w:hAnsi="Calibri"/>
-                <w:b w:val="0"/>
-                <w:sz w:val="18"/>
-              </w:rPr>
-              <w:t>GET</w:t>
-            </w:r>
-          </w:p>
-        </w:tc>
-        <w:tc>
-          <w:tcPr>
-            <w:tcW w:type="dxa" w:w="4032"/>
-            <w:vAlign w:val="center"/>
-          </w:tcPr>
-          <w:p>
-            <w:pPr>
-              <w:spacing w:after="0"/>
-            </w:pPr>
-            <w:r/>
-            <w:r>
-              <w:rPr>
-                <w:rFonts w:ascii="Calibri" w:hAnsi="Calibri"/>
-                <w:b w:val="0"/>
-                <w:sz w:val="18"/>
-              </w:rPr>
-              <w:t>/api/matrices-riesgos/{id}/evidencias</w:t>
-            </w:r>
-          </w:p>
-        </w:tc>
-        <w:tc>
-          <w:tcPr>
-            <w:tcW w:type="dxa" w:w="4176"/>
-            <w:vAlign w:val="center"/>
-          </w:tcPr>
-          <w:p>
-            <w:pPr>
-              <w:spacing w:after="0"/>
-            </w:pPr>
-            <w:r/>
-            <w:r>
-              <w:rPr>
-                <w:rFonts w:ascii="Calibri" w:hAnsi="Calibri"/>
-                <w:b w:val="0"/>
-                <w:sz w:val="18"/>
-              </w:rPr>
-              <w:t>Consultar evidencias de la matriz.</w:t>
-            </w:r>
-          </w:p>
-        </w:tc>
-      </w:tr>
-      <w:tr>
-        <w:tc>
-          <w:tcPr>
-            <w:tcW w:type="dxa" w:w="1008"/>
-            <w:vAlign w:val="center"/>
-          </w:tcPr>
-          <w:p>
-            <w:pPr>
-              <w:spacing w:after="0"/>
-            </w:pPr>
-            <w:r/>
-            <w:r>
-              <w:rPr>
-                <w:rFonts w:ascii="Calibri" w:hAnsi="Calibri"/>
-                <w:b w:val="0"/>
-                <w:sz w:val="18"/>
-              </w:rPr>
-              <w:t>POST</w:t>
-            </w:r>
-          </w:p>
-        </w:tc>
-        <w:tc>
-          <w:tcPr>
-            <w:tcW w:type="dxa" w:w="4032"/>
-            <w:vAlign w:val="center"/>
-          </w:tcPr>
-          <w:p>
-            <w:pPr>
-              <w:spacing w:after="0"/>
-            </w:pPr>
-            <w:r/>
-            <w:r>
-              <w:rPr>
-                <w:rFonts w:ascii="Calibri" w:hAnsi="Calibri"/>
-                <w:b w:val="0"/>
-                <w:sz w:val="18"/>
-              </w:rPr>
-              <w:t>/api/matrices-riesgos/{id}/evidencias</w:t>
-            </w:r>
-          </w:p>
-        </w:tc>
-        <w:tc>
-          <w:tcPr>
-            <w:tcW w:type="dxa" w:w="4176"/>
-            <w:vAlign w:val="center"/>
-          </w:tcPr>
-          <w:p>
-            <w:pPr>
-              <w:spacing w:after="0"/>
-            </w:pPr>
-            <w:r/>
-            <w:r>
-              <w:rPr>
-                <w:rFonts w:ascii="Calibri" w:hAnsi="Calibri"/>
-                <w:b w:val="0"/>
-                <w:sz w:val="18"/>
-              </w:rPr>
-              <w:t>Cargar evidencia documental en formulario multipart.</w:t>
-            </w:r>
-          </w:p>
-        </w:tc>
-      </w:tr>
-      <w:tr>
-        <w:tc>
-          <w:tcPr>
-            <w:tcW w:type="dxa" w:w="1008"/>
-            <w:vAlign w:val="center"/>
-          </w:tcPr>
-          <w:p>
-            <w:pPr>
-              <w:spacing w:after="0"/>
-            </w:pPr>
-            <w:r/>
-            <w:r>
-              <w:rPr>
-                <w:rFonts w:ascii="Calibri" w:hAnsi="Calibri"/>
-                <w:b w:val="0"/>
-                <w:sz w:val="18"/>
-              </w:rPr>
-              <w:t>GET</w:t>
-            </w:r>
-          </w:p>
-        </w:tc>
-        <w:tc>
-          <w:tcPr>
-            <w:tcW w:type="dxa" w:w="4032"/>
-            <w:vAlign w:val="center"/>
-          </w:tcPr>
-          <w:p>
-            <w:pPr>
-              <w:spacing w:after="0"/>
-            </w:pPr>
-            <w:r/>
-            <w:r>
-              <w:rPr>
-                <w:rFonts w:ascii="Calibri" w:hAnsi="Calibri"/>
-                <w:b w:val="0"/>
-                <w:sz w:val="18"/>
-              </w:rPr>
-              <w:t>/api/matrices-riesgos/{id}/evidencias/{evidenciaId}/descargar</w:t>
-            </w:r>
-          </w:p>
-        </w:tc>
-        <w:tc>
-          <w:tcPr>
-            <w:tcW w:type="dxa" w:w="4176"/>
-            <w:vAlign w:val="center"/>
-          </w:tcPr>
-          <w:p>
-            <w:pPr>
-              <w:spacing w:after="0"/>
-            </w:pPr>
-            <w:r/>
-            <w:r>
-              <w:rPr>
-                <w:rFonts w:ascii="Calibri" w:hAnsi="Calibri"/>
-                <w:b w:val="0"/>
-                <w:sz w:val="18"/>
-              </w:rPr>
-              <w:t>Descargar o visualizar evidencia con auditoría.</w:t>
-            </w:r>
-          </w:p>
-        </w:tc>
-      </w:tr>
-      <w:tr>
-        <w:tc>
-          <w:tcPr>
-            <w:tcW w:type="dxa" w:w="1008"/>
-            <w:vAlign w:val="center"/>
-          </w:tcPr>
-          <w:p>
-            <w:pPr>
-              <w:spacing w:after="0"/>
-            </w:pPr>
-            <w:r/>
-            <w:r>
-              <w:rPr>
-                <w:rFonts w:ascii="Calibri" w:hAnsi="Calibri"/>
-                <w:b w:val="0"/>
-                <w:sz w:val="18"/>
-              </w:rPr>
-              <w:t>PUT</w:t>
-            </w:r>
-          </w:p>
-        </w:tc>
-        <w:tc>
-          <w:tcPr>
-            <w:tcW w:type="dxa" w:w="4032"/>
-            <w:vAlign w:val="center"/>
-          </w:tcPr>
-          <w:p>
-            <w:pPr>
-              <w:spacing w:after="0"/>
-            </w:pPr>
-            <w:r/>
-            <w:r>
-              <w:rPr>
-                <w:rFonts w:ascii="Calibri" w:hAnsi="Calibri"/>
-                <w:b w:val="0"/>
-                <w:sz w:val="18"/>
-              </w:rPr>
-              <w:t>/api/matrices-riesgos/{id}/evidencias/{evidenciaId}/inactivar</w:t>
-            </w:r>
-          </w:p>
-        </w:tc>
-        <w:tc>
-          <w:tcPr>
-            <w:tcW w:type="dxa" w:w="4176"/>
-            <w:vAlign w:val="center"/>
-          </w:tcPr>
-          <w:p>
-            <w:pPr>
-              <w:spacing w:after="0"/>
-            </w:pPr>
-            <w:r/>
-            <w:r>
-              <w:rPr>
-                <w:rFonts w:ascii="Calibri" w:hAnsi="Calibri"/>
-                <w:b w:val="0"/>
-                <w:sz w:val="18"/>
-              </w:rPr>
-              <w:t>Inactivar evidencia con motivo obligatorio.</w:t>
+              <w:t>Compilación correcta mediante npm.cmd run build.</w:t>
             </w:r>
           </w:p>
         </w:tc>
@@ -1939,11 +1646,7 @@
         <w:pStyle w:val="Heading1"/>
       </w:pPr>
       <w:r>
-        <w:rPr>
-          <w:rFonts w:ascii="Calibri" w:hAnsi="Calibri"/>
-          <w:color w:val="2E74B5"/>
-        </w:rPr>
-        <w:t>7. Tablas Involucradas</w:t>
+        <w:t>8. Observaciones controladas</w:t>
       </w:r>
     </w:p>
     <w:tbl>
@@ -1954,51 +1657,43 @@
         <w:tblLook w:firstColumn="1" w:firstRow="1" w:lastColumn="0" w:lastRow="0" w:noHBand="0" w:noVBand="1" w:val="04A0"/>
       </w:tblPr>
       <w:tblGrid>
-        <w:gridCol w:w="4680"/>
-        <w:gridCol w:w="4680"/>
+        <w:gridCol w:w="5112"/>
+        <w:gridCol w:w="5112"/>
       </w:tblGrid>
       <w:tr>
         <w:tc>
           <w:tcPr>
-            <w:tcW w:type="dxa" w:w="2880"/>
-            <w:shd w:fill="E8EEF5"/>
+            <w:tcW w:type="dxa" w:w="3600"/>
             <w:vAlign w:val="center"/>
+            <w:shd w:fill="1F3F8D"/>
           </w:tcPr>
           <w:p>
-            <w:pPr>
-              <w:spacing w:after="0"/>
-            </w:pPr>
             <w:r/>
             <w:r>
               <w:rPr>
-                <w:rFonts w:ascii="Calibri" w:hAnsi="Calibri"/>
                 <w:b/>
-                <w:color w:val="0B2545"/>
+                <w:color w:val="FFFFFF"/>
                 <w:sz w:val="18"/>
               </w:rPr>
-              <w:t>Tabla</w:t>
+              <w:t>Observación</w:t>
             </w:r>
           </w:p>
         </w:tc>
         <w:tc>
           <w:tcPr>
-            <w:tcW w:type="dxa" w:w="6336"/>
-            <w:shd w:fill="E8EEF5"/>
+            <w:tcW w:type="dxa" w:w="6912"/>
             <w:vAlign w:val="center"/>
+            <w:shd w:fill="1F3F8D"/>
           </w:tcPr>
           <w:p>
-            <w:pPr>
-              <w:spacing w:after="0"/>
-            </w:pPr>
             <w:r/>
             <w:r>
               <w:rPr>
-                <w:rFonts w:ascii="Calibri" w:hAnsi="Calibri"/>
                 <w:b/>
-                <w:color w:val="0B2545"/>
+                <w:color w:val="FFFFFF"/>
                 <w:sz w:val="18"/>
               </w:rPr>
-              <w:t>Uso en Fase 10</w:t>
+              <w:t>Tratamiento</w:t>
             </w:r>
           </w:p>
         </w:tc>
@@ -2006,41 +1701,33 @@
       <w:tr>
         <w:tc>
           <w:tcPr>
-            <w:tcW w:type="dxa" w:w="2880"/>
+            <w:tcW w:type="dxa" w:w="3600"/>
             <w:vAlign w:val="center"/>
           </w:tcPr>
           <w:p>
-            <w:pPr>
-              <w:spacing w:after="0"/>
-            </w:pPr>
             <w:r/>
             <w:r>
               <w:rPr>
-                <w:rFonts w:ascii="Calibri" w:hAnsi="Calibri"/>
                 <w:b w:val="0"/>
                 <w:sz w:val="18"/>
               </w:rPr>
-              <w:t>RL_MR_MATRICES</w:t>
+              <w:t>Aprobación formal</w:t>
             </w:r>
           </w:p>
         </w:tc>
         <w:tc>
           <w:tcPr>
-            <w:tcW w:type="dxa" w:w="6336"/>
+            <w:tcW w:type="dxa" w:w="6912"/>
             <w:vAlign w:val="center"/>
           </w:tcPr>
           <w:p>
-            <w:pPr>
-              <w:spacing w:after="0"/>
-            </w:pPr>
             <w:r/>
             <w:r>
               <w:rPr>
-                <w:rFonts w:ascii="Calibri" w:hAnsi="Calibri"/>
                 <w:b w:val="0"/>
                 <w:sz w:val="18"/>
               </w:rPr>
-              <w:t>Matriz base, estado y bloqueo de cierre.</w:t>
+              <w:t>La fase no se marca como cerrada hasta recibir aprobación formal de Javier Mejía.</w:t>
             </w:r>
           </w:p>
         </w:tc>
@@ -2048,41 +1735,33 @@
       <w:tr>
         <w:tc>
           <w:tcPr>
-            <w:tcW w:type="dxa" w:w="2880"/>
+            <w:tcW w:type="dxa" w:w="3600"/>
             <w:vAlign w:val="center"/>
           </w:tcPr>
           <w:p>
-            <w:pPr>
-              <w:spacing w:after="0"/>
-            </w:pPr>
             <w:r/>
             <w:r>
               <w:rPr>
-                <w:rFonts w:ascii="Calibri" w:hAnsi="Calibri"/>
                 <w:b w:val="0"/>
                 <w:sz w:val="18"/>
               </w:rPr>
-              <w:t>RL_MR_RESULTADOS</w:t>
+              <w:t>Sincronización Git remota</w:t>
             </w:r>
           </w:p>
         </w:tc>
         <w:tc>
           <w:tcPr>
-            <w:tcW w:type="dxa" w:w="6336"/>
+            <w:tcW w:type="dxa" w:w="6912"/>
             <w:vAlign w:val="center"/>
           </w:tcPr>
           <w:p>
-            <w:pPr>
-              <w:spacing w:after="0"/>
-            </w:pPr>
             <w:r/>
             <w:r>
               <w:rPr>
-                <w:rFonts w:ascii="Calibri" w:hAnsi="Calibri"/>
                 <w:b w:val="0"/>
                 <w:sz w:val="18"/>
               </w:rPr>
-              <w:t>Resultado vigente usado para determinar plan requerido.</w:t>
+              <w:t>Pendiente de confirmación por bloqueo de certificado SSL al intentar sincronizar contra el repositorio remoto.</w:t>
             </w:r>
           </w:p>
         </w:tc>
@@ -2090,209 +1769,33 @@
       <w:tr>
         <w:tc>
           <w:tcPr>
-            <w:tcW w:type="dxa" w:w="2880"/>
+            <w:tcW w:type="dxa" w:w="3600"/>
             <w:vAlign w:val="center"/>
           </w:tcPr>
           <w:p>
-            <w:pPr>
-              <w:spacing w:after="0"/>
-            </w:pPr>
             <w:r/>
             <w:r>
               <w:rPr>
-                <w:rFonts w:ascii="Calibri" w:hAnsi="Calibri"/>
                 <w:b w:val="0"/>
                 <w:sz w:val="18"/>
               </w:rPr>
-              <w:t>RL_MR_PLANES_ACCION</w:t>
+              <w:t>Capturas navegadas</w:t>
             </w:r>
           </w:p>
         </w:tc>
         <w:tc>
           <w:tcPr>
-            <w:tcW w:type="dxa" w:w="6336"/>
+            <w:tcW w:type="dxa" w:w="6912"/>
             <w:vAlign w:val="center"/>
           </w:tcPr>
           <w:p>
-            <w:pPr>
-              <w:spacing w:after="0"/>
-            </w:pPr>
             <w:r/>
             <w:r>
               <w:rPr>
-                <w:rFonts w:ascii="Calibri" w:hAnsi="Calibri"/>
                 <w:b w:val="0"/>
                 <w:sz w:val="18"/>
               </w:rPr>
-              <w:t>Planes, responsables, fechas, estados y motivos de cierre.</w:t>
-            </w:r>
-          </w:p>
-        </w:tc>
-      </w:tr>
-      <w:tr>
-        <w:tc>
-          <w:tcPr>
-            <w:tcW w:type="dxa" w:w="2880"/>
-            <w:vAlign w:val="center"/>
-          </w:tcPr>
-          <w:p>
-            <w:pPr>
-              <w:spacing w:after="0"/>
-            </w:pPr>
-            <w:r/>
-            <w:r>
-              <w:rPr>
-                <w:rFonts w:ascii="Calibri" w:hAnsi="Calibri"/>
-                <w:b w:val="0"/>
-                <w:sz w:val="18"/>
-              </w:rPr>
-              <w:t>RL_MR_EVIDENCIAS</w:t>
-            </w:r>
-          </w:p>
-        </w:tc>
-        <w:tc>
-          <w:tcPr>
-            <w:tcW w:type="dxa" w:w="6336"/>
-            <w:vAlign w:val="center"/>
-          </w:tcPr>
-          <w:p>
-            <w:pPr>
-              <w:spacing w:after="0"/>
-            </w:pPr>
-            <w:r/>
-            <w:r>
-              <w:rPr>
-                <w:rFonts w:ascii="Calibri" w:hAnsi="Calibri"/>
-                <w:b w:val="0"/>
-                <w:sz w:val="18"/>
-              </w:rPr>
-              <w:t>Evidencias documentales, metadatos, ruta física, hash e inactivación lógica.</w:t>
-            </w:r>
-          </w:p>
-        </w:tc>
-      </w:tr>
-      <w:tr>
-        <w:tc>
-          <w:tcPr>
-            <w:tcW w:type="dxa" w:w="2880"/>
-            <w:vAlign w:val="center"/>
-          </w:tcPr>
-          <w:p>
-            <w:pPr>
-              <w:spacing w:after="0"/>
-            </w:pPr>
-            <w:r/>
-            <w:r>
-              <w:rPr>
-                <w:rFonts w:ascii="Calibri" w:hAnsi="Calibri"/>
-                <w:b w:val="0"/>
-                <w:sz w:val="18"/>
-              </w:rPr>
-              <w:t>RL_MR_CONTROLES</w:t>
-            </w:r>
-          </w:p>
-        </w:tc>
-        <w:tc>
-          <w:tcPr>
-            <w:tcW w:type="dxa" w:w="6336"/>
-            <w:vAlign w:val="center"/>
-          </w:tcPr>
-          <w:p>
-            <w:pPr>
-              <w:spacing w:after="0"/>
-            </w:pPr>
-            <w:r/>
-            <w:r>
-              <w:rPr>
-                <w:rFonts w:ascii="Calibri" w:hAnsi="Calibri"/>
-                <w:b w:val="0"/>
-                <w:sz w:val="18"/>
-              </w:rPr>
-              <w:t>Vínculo opcional de evidencia contra control mitigante.</w:t>
-            </w:r>
-          </w:p>
-        </w:tc>
-      </w:tr>
-      <w:tr>
-        <w:tc>
-          <w:tcPr>
-            <w:tcW w:type="dxa" w:w="2880"/>
-            <w:vAlign w:val="center"/>
-          </w:tcPr>
-          <w:p>
-            <w:pPr>
-              <w:spacing w:after="0"/>
-            </w:pPr>
-            <w:r/>
-            <w:r>
-              <w:rPr>
-                <w:rFonts w:ascii="Calibri" w:hAnsi="Calibri"/>
-                <w:b w:val="0"/>
-                <w:sz w:val="18"/>
-              </w:rPr>
-              <w:t>RL_MR_HISTORIAL</w:t>
-            </w:r>
-          </w:p>
-        </w:tc>
-        <w:tc>
-          <w:tcPr>
-            <w:tcW w:type="dxa" w:w="6336"/>
-            <w:vAlign w:val="center"/>
-          </w:tcPr>
-          <w:p>
-            <w:pPr>
-              <w:spacing w:after="0"/>
-            </w:pPr>
-            <w:r/>
-            <w:r>
-              <w:rPr>
-                <w:rFonts w:ascii="Calibri" w:hAnsi="Calibri"/>
-                <w:b w:val="0"/>
-                <w:sz w:val="18"/>
-              </w:rPr>
-              <w:t>Trazabilidad funcional de creación, edición, cambios de estado, descargas e inactivaciones.</w:t>
-            </w:r>
-          </w:p>
-        </w:tc>
-      </w:tr>
-      <w:tr>
-        <w:tc>
-          <w:tcPr>
-            <w:tcW w:type="dxa" w:w="2880"/>
-            <w:vAlign w:val="center"/>
-          </w:tcPr>
-          <w:p>
-            <w:pPr>
-              <w:spacing w:after="0"/>
-            </w:pPr>
-            <w:r/>
-            <w:r>
-              <w:rPr>
-                <w:rFonts w:ascii="Calibri" w:hAnsi="Calibri"/>
-                <w:b w:val="0"/>
-                <w:sz w:val="18"/>
-              </w:rPr>
-              <w:t>RL_AUDITORIA</w:t>
-            </w:r>
-          </w:p>
-        </w:tc>
-        <w:tc>
-          <w:tcPr>
-            <w:tcW w:type="dxa" w:w="6336"/>
-            <w:vAlign w:val="center"/>
-          </w:tcPr>
-          <w:p>
-            <w:pPr>
-              <w:spacing w:after="0"/>
-            </w:pPr>
-            <w:r/>
-            <w:r>
-              <w:rPr>
-                <w:rFonts w:ascii="Calibri" w:hAnsi="Calibri"/>
-                <w:b w:val="0"/>
-                <w:sz w:val="18"/>
-              </w:rPr>
-              <w:t>Auditoría técnica de INSERT, UPDATE, DELETE y VER con usuario e IP.</w:t>
+              <w:t>Pueden adjuntarse como evidencia visual complementaria; no bloquean la validación técnica API/DBA.</w:t>
             </w:r>
           </w:p>
         </w:tc>
@@ -2304,11 +1807,7 @@
         <w:pStyle w:val="Heading1"/>
       </w:pPr>
       <w:r>
-        <w:rPr>
-          <w:rFonts w:ascii="Calibri" w:hAnsi="Calibri"/>
-          <w:color w:val="2E74B5"/>
-        </w:rPr>
-        <w:t>8. Auditoría e Historial</w:t>
+        <w:t>9. Criterios de aceptación</w:t>
       </w:r>
     </w:p>
     <w:tbl>
@@ -2319,74 +1818,43 @@
         <w:tblLook w:firstColumn="1" w:firstRow="1" w:lastColumn="0" w:lastRow="0" w:noHBand="0" w:noVBand="1" w:val="04A0"/>
       </w:tblPr>
       <w:tblGrid>
-        <w:gridCol w:w="3120"/>
-        <w:gridCol w:w="3120"/>
-        <w:gridCol w:w="3120"/>
+        <w:gridCol w:w="5112"/>
+        <w:gridCol w:w="5112"/>
       </w:tblGrid>
       <w:tr>
         <w:tc>
           <w:tcPr>
-            <w:tcW w:type="dxa" w:w="2592"/>
-            <w:shd w:fill="E8EEF5"/>
+            <w:tcW w:type="dxa" w:w="6912"/>
             <w:vAlign w:val="center"/>
+            <w:shd w:fill="1F3F8D"/>
           </w:tcPr>
           <w:p>
-            <w:pPr>
-              <w:spacing w:after="0"/>
-            </w:pPr>
             <w:r/>
             <w:r>
               <w:rPr>
-                <w:rFonts w:ascii="Calibri" w:hAnsi="Calibri"/>
                 <w:b/>
-                <w:color w:val="0B2545"/>
+                <w:color w:val="FFFFFF"/>
                 <w:sz w:val="18"/>
               </w:rPr>
-              <w:t>Evento</w:t>
+              <w:t>Criterio</w:t>
             </w:r>
           </w:p>
         </w:tc>
         <w:tc>
           <w:tcPr>
-            <w:tcW w:type="dxa" w:w="3168"/>
-            <w:shd w:fill="E8EEF5"/>
+            <w:tcW w:type="dxa" w:w="2592"/>
             <w:vAlign w:val="center"/>
+            <w:shd w:fill="1F3F8D"/>
           </w:tcPr>
           <w:p>
-            <w:pPr>
-              <w:spacing w:after="0"/>
-            </w:pPr>
             <w:r/>
             <w:r>
               <w:rPr>
-                <w:rFonts w:ascii="Calibri" w:hAnsi="Calibri"/>
                 <w:b/>
-                <w:color w:val="0B2545"/>
+                <w:color w:val="FFFFFF"/>
                 <w:sz w:val="18"/>
               </w:rPr>
-              <w:t>Historial</w:t>
-            </w:r>
-          </w:p>
-        </w:tc>
-        <w:tc>
-          <w:tcPr>
-            <w:tcW w:type="dxa" w:w="3456"/>
-            <w:shd w:fill="E8EEF5"/>
-            <w:vAlign w:val="center"/>
-          </w:tcPr>
-          <w:p>
-            <w:pPr>
-              <w:spacing w:after="0"/>
-            </w:pPr>
-            <w:r/>
-            <w:r>
-              <w:rPr>
-                <w:rFonts w:ascii="Calibri" w:hAnsi="Calibri"/>
-                <w:b/>
-                <w:color w:val="0B2545"/>
-                <w:sz w:val="18"/>
-              </w:rPr>
-              <w:t>Auditoría</w:t>
+              <w:t>Estado</w:t>
             </w:r>
           </w:p>
         </w:tc>
@@ -2394,61 +1862,33 @@
       <w:tr>
         <w:tc>
           <w:tcPr>
-            <w:tcW w:type="dxa" w:w="2592"/>
+            <w:tcW w:type="dxa" w:w="6912"/>
             <w:vAlign w:val="center"/>
           </w:tcPr>
           <w:p>
-            <w:pPr>
-              <w:spacing w:after="0"/>
-            </w:pPr>
             <w:r/>
             <w:r>
               <w:rPr>
-                <w:rFonts w:ascii="Calibri" w:hAnsi="Calibri"/>
                 <w:b w:val="0"/>
                 <w:sz w:val="18"/>
               </w:rPr>
-              <w:t>Crear plan</w:t>
+              <w:t>Planes de acción con estados auditables</w:t>
             </w:r>
           </w:p>
         </w:tc>
         <w:tc>
           <w:tcPr>
-            <w:tcW w:type="dxa" w:w="3168"/>
+            <w:tcW w:type="dxa" w:w="2592"/>
             <w:vAlign w:val="center"/>
           </w:tcPr>
           <w:p>
-            <w:pPr>
-              <w:spacing w:after="0"/>
-            </w:pPr>
             <w:r/>
             <w:r>
               <w:rPr>
-                <w:rFonts w:ascii="Calibri" w:hAnsi="Calibri"/>
                 <w:b w:val="0"/>
                 <w:sz w:val="18"/>
               </w:rPr>
-              <w:t>CREACION_PLAN</w:t>
-            </w:r>
-          </w:p>
-        </w:tc>
-        <w:tc>
-          <w:tcPr>
-            <w:tcW w:type="dxa" w:w="3456"/>
-            <w:vAlign w:val="center"/>
-          </w:tcPr>
-          <w:p>
-            <w:pPr>
-              <w:spacing w:after="0"/>
-            </w:pPr>
-            <w:r/>
-            <w:r>
-              <w:rPr>
-                <w:rFonts w:ascii="Calibri" w:hAnsi="Calibri"/>
-                <w:b w:val="0"/>
-                <w:sz w:val="18"/>
-              </w:rPr>
-              <w:t>INSERT sobre RL_MR_PLANES_ACCION</w:t>
+              <w:t>Cumplido</w:t>
             </w:r>
           </w:p>
         </w:tc>
@@ -2456,61 +1896,33 @@
       <w:tr>
         <w:tc>
           <w:tcPr>
-            <w:tcW w:type="dxa" w:w="2592"/>
+            <w:tcW w:type="dxa" w:w="6912"/>
             <w:vAlign w:val="center"/>
           </w:tcPr>
           <w:p>
-            <w:pPr>
-              <w:spacing w:after="0"/>
-            </w:pPr>
             <w:r/>
             <w:r>
               <w:rPr>
-                <w:rFonts w:ascii="Calibri" w:hAnsi="Calibri"/>
                 <w:b w:val="0"/>
                 <w:sz w:val="18"/>
               </w:rPr>
-              <w:t>Editar plan</w:t>
+              <w:t>Motivo obligatorio en inactivación/reactivación</w:t>
             </w:r>
           </w:p>
         </w:tc>
         <w:tc>
           <w:tcPr>
-            <w:tcW w:type="dxa" w:w="3168"/>
+            <w:tcW w:type="dxa" w:w="2592"/>
             <w:vAlign w:val="center"/>
           </w:tcPr>
           <w:p>
-            <w:pPr>
-              <w:spacing w:after="0"/>
-            </w:pPr>
             <w:r/>
             <w:r>
               <w:rPr>
-                <w:rFonts w:ascii="Calibri" w:hAnsi="Calibri"/>
                 <w:b w:val="0"/>
                 <w:sz w:val="18"/>
               </w:rPr>
-              <w:t>EDICION_PLAN</w:t>
-            </w:r>
-          </w:p>
-        </w:tc>
-        <w:tc>
-          <w:tcPr>
-            <w:tcW w:type="dxa" w:w="3456"/>
-            <w:vAlign w:val="center"/>
-          </w:tcPr>
-          <w:p>
-            <w:pPr>
-              <w:spacing w:after="0"/>
-            </w:pPr>
-            <w:r/>
-            <w:r>
-              <w:rPr>
-                <w:rFonts w:ascii="Calibri" w:hAnsi="Calibri"/>
-                <w:b w:val="0"/>
-                <w:sz w:val="18"/>
-              </w:rPr>
-              <w:t>UPDATE sobre RL_MR_PLANES_ACCION</w:t>
+              <w:t>Cumplido</w:t>
             </w:r>
           </w:p>
         </w:tc>
@@ -2518,61 +1930,33 @@
       <w:tr>
         <w:tc>
           <w:tcPr>
-            <w:tcW w:type="dxa" w:w="2592"/>
+            <w:tcW w:type="dxa" w:w="6912"/>
             <w:vAlign w:val="center"/>
           </w:tcPr>
           <w:p>
-            <w:pPr>
-              <w:spacing w:after="0"/>
-            </w:pPr>
             <w:r/>
             <w:r>
               <w:rPr>
-                <w:rFonts w:ascii="Calibri" w:hAnsi="Calibri"/>
                 <w:b w:val="0"/>
                 <w:sz w:val="18"/>
               </w:rPr>
-              <w:t>Cambiar estado de plan</w:t>
+              <w:t>Evidencias con carga, descarga y eliminación lógica</w:t>
             </w:r>
           </w:p>
         </w:tc>
         <w:tc>
           <w:tcPr>
-            <w:tcW w:type="dxa" w:w="3168"/>
+            <w:tcW w:type="dxa" w:w="2592"/>
             <w:vAlign w:val="center"/>
           </w:tcPr>
           <w:p>
-            <w:pPr>
-              <w:spacing w:after="0"/>
-            </w:pPr>
             <w:r/>
             <w:r>
               <w:rPr>
-                <w:rFonts w:ascii="Calibri" w:hAnsi="Calibri"/>
                 <w:b w:val="0"/>
                 <w:sz w:val="18"/>
               </w:rPr>
-              <w:t>CAMBIO_ESTADO_PLAN</w:t>
-            </w:r>
-          </w:p>
-        </w:tc>
-        <w:tc>
-          <w:tcPr>
-            <w:tcW w:type="dxa" w:w="3456"/>
-            <w:vAlign w:val="center"/>
-          </w:tcPr>
-          <w:p>
-            <w:pPr>
-              <w:spacing w:after="0"/>
-            </w:pPr>
-            <w:r/>
-            <w:r>
-              <w:rPr>
-                <w:rFonts w:ascii="Calibri" w:hAnsi="Calibri"/>
-                <w:b w:val="0"/>
-                <w:sz w:val="18"/>
-              </w:rPr>
-              <w:t>UPDATE sobre RL_MR_PLANES_ACCION</w:t>
+              <w:t>Cumplido</w:t>
             </w:r>
           </w:p>
         </w:tc>
@@ -2580,61 +1964,33 @@
       <w:tr>
         <w:tc>
           <w:tcPr>
-            <w:tcW w:type="dxa" w:w="2592"/>
+            <w:tcW w:type="dxa" w:w="6912"/>
             <w:vAlign w:val="center"/>
           </w:tcPr>
           <w:p>
-            <w:pPr>
-              <w:spacing w:after="0"/>
-            </w:pPr>
             <w:r/>
             <w:r>
               <w:rPr>
-                <w:rFonts w:ascii="Calibri" w:hAnsi="Calibri"/>
                 <w:b w:val="0"/>
                 <w:sz w:val="18"/>
               </w:rPr>
-              <w:t>Cargar evidencia</w:t>
+              <w:t>Historial funcional actualizado</w:t>
             </w:r>
           </w:p>
         </w:tc>
         <w:tc>
           <w:tcPr>
-            <w:tcW w:type="dxa" w:w="3168"/>
+            <w:tcW w:type="dxa" w:w="2592"/>
             <w:vAlign w:val="center"/>
           </w:tcPr>
           <w:p>
-            <w:pPr>
-              <w:spacing w:after="0"/>
-            </w:pPr>
             <w:r/>
             <w:r>
               <w:rPr>
-                <w:rFonts w:ascii="Calibri" w:hAnsi="Calibri"/>
                 <w:b w:val="0"/>
                 <w:sz w:val="18"/>
               </w:rPr>
-              <w:t>CARGA_EVIDENCIA</w:t>
-            </w:r>
-          </w:p>
-        </w:tc>
-        <w:tc>
-          <w:tcPr>
-            <w:tcW w:type="dxa" w:w="3456"/>
-            <w:vAlign w:val="center"/>
-          </w:tcPr>
-          <w:p>
-            <w:pPr>
-              <w:spacing w:after="0"/>
-            </w:pPr>
-            <w:r/>
-            <w:r>
-              <w:rPr>
-                <w:rFonts w:ascii="Calibri" w:hAnsi="Calibri"/>
-                <w:b w:val="0"/>
-                <w:sz w:val="18"/>
-              </w:rPr>
-              <w:t>INSERT sobre RL_MR_EVIDENCIAS</w:t>
+              <w:t>Cumplido</w:t>
             </w:r>
           </w:p>
         </w:tc>
@@ -2642,61 +1998,33 @@
       <w:tr>
         <w:tc>
           <w:tcPr>
-            <w:tcW w:type="dxa" w:w="2592"/>
+            <w:tcW w:type="dxa" w:w="6912"/>
             <w:vAlign w:val="center"/>
           </w:tcPr>
           <w:p>
-            <w:pPr>
-              <w:spacing w:after="0"/>
-            </w:pPr>
             <w:r/>
             <w:r>
               <w:rPr>
-                <w:rFonts w:ascii="Calibri" w:hAnsi="Calibri"/>
                 <w:b w:val="0"/>
                 <w:sz w:val="18"/>
               </w:rPr>
-              <w:t>Descargar evidencia</w:t>
+              <w:t>Auditoría registrada</w:t>
             </w:r>
           </w:p>
         </w:tc>
         <w:tc>
           <w:tcPr>
-            <w:tcW w:type="dxa" w:w="3168"/>
+            <w:tcW w:type="dxa" w:w="2592"/>
             <w:vAlign w:val="center"/>
           </w:tcPr>
           <w:p>
-            <w:pPr>
-              <w:spacing w:after="0"/>
-            </w:pPr>
             <w:r/>
             <w:r>
               <w:rPr>
-                <w:rFonts w:ascii="Calibri" w:hAnsi="Calibri"/>
                 <w:b w:val="0"/>
                 <w:sz w:val="18"/>
               </w:rPr>
-              <w:t>DESCARGA_EVIDENCIA</w:t>
-            </w:r>
-          </w:p>
-        </w:tc>
-        <w:tc>
-          <w:tcPr>
-            <w:tcW w:type="dxa" w:w="3456"/>
-            <w:vAlign w:val="center"/>
-          </w:tcPr>
-          <w:p>
-            <w:pPr>
-              <w:spacing w:after="0"/>
-            </w:pPr>
-            <w:r/>
-            <w:r>
-              <w:rPr>
-                <w:rFonts w:ascii="Calibri" w:hAnsi="Calibri"/>
-                <w:b w:val="0"/>
-                <w:sz w:val="18"/>
-              </w:rPr>
-              <w:t>VER sobre RL_MR_EVIDENCIAS</w:t>
+              <w:t>Cumplido</w:t>
             </w:r>
           </w:p>
         </w:tc>
@@ -2704,61 +2032,67 @@
       <w:tr>
         <w:tc>
           <w:tcPr>
-            <w:tcW w:type="dxa" w:w="2592"/>
+            <w:tcW w:type="dxa" w:w="6912"/>
             <w:vAlign w:val="center"/>
           </w:tcPr>
           <w:p>
-            <w:pPr>
-              <w:spacing w:after="0"/>
-            </w:pPr>
             <w:r/>
             <w:r>
               <w:rPr>
-                <w:rFonts w:ascii="Calibri" w:hAnsi="Calibri"/>
                 <w:b w:val="0"/>
                 <w:sz w:val="18"/>
               </w:rPr>
-              <w:t>Inactivar evidencia</w:t>
+              <w:t>Sin acoplamiento con Monitoreo de Listas</w:t>
             </w:r>
           </w:p>
         </w:tc>
         <w:tc>
           <w:tcPr>
-            <w:tcW w:type="dxa" w:w="3168"/>
+            <w:tcW w:type="dxa" w:w="2592"/>
             <w:vAlign w:val="center"/>
           </w:tcPr>
           <w:p>
-            <w:pPr>
-              <w:spacing w:after="0"/>
-            </w:pPr>
             <w:r/>
             <w:r>
               <w:rPr>
-                <w:rFonts w:ascii="Calibri" w:hAnsi="Calibri"/>
                 <w:b w:val="0"/>
                 <w:sz w:val="18"/>
               </w:rPr>
-              <w:t>ELIMINACION_LOGICA_EVIDENCIA</w:t>
+              <w:t>Cumplido</w:t>
+            </w:r>
+          </w:p>
+        </w:tc>
+      </w:tr>
+      <w:tr>
+        <w:tc>
+          <w:tcPr>
+            <w:tcW w:type="dxa" w:w="6912"/>
+            <w:vAlign w:val="center"/>
+          </w:tcPr>
+          <w:p>
+            <w:r/>
+            <w:r>
+              <w:rPr>
+                <w:b w:val="0"/>
+                <w:sz w:val="18"/>
+              </w:rPr>
+              <w:t>Sin cambios de permisos por acción</w:t>
             </w:r>
           </w:p>
         </w:tc>
         <w:tc>
           <w:tcPr>
-            <w:tcW w:type="dxa" w:w="3456"/>
+            <w:tcW w:type="dxa" w:w="2592"/>
             <w:vAlign w:val="center"/>
           </w:tcPr>
           <w:p>
-            <w:pPr>
-              <w:spacing w:after="0"/>
-            </w:pPr>
             <w:r/>
             <w:r>
               <w:rPr>
-                <w:rFonts w:ascii="Calibri" w:hAnsi="Calibri"/>
                 <w:b w:val="0"/>
                 <w:sz w:val="18"/>
               </w:rPr>
-              <w:t>DELETE lógico sobre RL_MR_EVIDENCIAS</w:t>
+              <w:t>Cumplido</w:t>
             </w:r>
           </w:p>
         </w:tc>
@@ -2770,881 +2104,27 @@
         <w:pStyle w:val="Heading1"/>
       </w:pPr>
       <w:r>
-        <w:rPr>
-          <w:rFonts w:ascii="Calibri" w:hAnsi="Calibri"/>
-          <w:color w:val="2E74B5"/>
-        </w:rPr>
-        <w:t>9. Frontend Implementado</w:t>
-      </w:r>
-    </w:p>
-    <w:p>
-      <w:pPr>
-        <w:pStyle w:val="ListBullet"/>
-        <w:spacing w:after="80"/>
-      </w:pPr>
-      <w:r>
-        <w:t>Nuevo submódulo visual: Planes y evidencias dentro de Matrices de Riesgos.</w:t>
-      </w:r>
-    </w:p>
-    <w:p>
-      <w:pPr>
-        <w:pStyle w:val="ListBullet"/>
-        <w:spacing w:after="80"/>
-      </w:pPr>
-      <w:r>
-        <w:t>Selector de matriz para consultar planes, evidencias y contexto de tratamiento.</w:t>
-      </w:r>
-    </w:p>
-    <w:p>
-      <w:pPr>
-        <w:pStyle w:val="ListBullet"/>
-        <w:spacing w:after="80"/>
-      </w:pPr>
-      <w:r>
-        <w:t>Formulario para crear o editar planes con actividad, responsable, periodicidad, fechas, medio de prueba y observaciones.</w:t>
-      </w:r>
-    </w:p>
-    <w:p>
-      <w:pPr>
-        <w:pStyle w:val="ListBullet"/>
-        <w:spacing w:after="80"/>
-      </w:pPr>
-      <w:r>
-        <w:t>Tabla de planes con estado, vencimiento, edición, cambio de estado e inactivación lógica.</w:t>
-      </w:r>
-    </w:p>
-    <w:p>
-      <w:pPr>
-        <w:pStyle w:val="ListBullet"/>
-        <w:spacing w:after="80"/>
-      </w:pPr>
-      <w:r>
-        <w:t>Carga de evidencia con archivo, vínculo opcional a plan y vínculo opcional a control mitigante.</w:t>
-      </w:r>
-    </w:p>
-    <w:p>
-      <w:pPr>
-        <w:pStyle w:val="ListBullet"/>
-        <w:spacing w:after="80"/>
-      </w:pPr>
-      <w:r>
-        <w:t>Descarga e inactivación lógica de evidencias desde la interfaz.</w:t>
-      </w:r>
-    </w:p>
-    <w:p>
-      <w:pPr>
-        <w:pStyle w:val="ListBullet"/>
-        <w:spacing w:after="80"/>
-      </w:pPr>
-      <w:r>
-        <w:t>Confirmaciones mediante modal para acciones sensibles y motivo obligatorio cuando aplica.</w:t>
-      </w:r>
-    </w:p>
-    <w:p>
-      <w:pPr>
-        <w:pStyle w:val="Heading1"/>
-      </w:pPr>
-      <w:r>
-        <w:rPr>
-          <w:rFonts w:ascii="Calibri" w:hAnsi="Calibri"/>
-          <w:color w:val="2E74B5"/>
-        </w:rPr>
-        <w:t>10. Separación de Módulos</w:t>
+        <w:t>10. Conclusión técnica</w:t>
       </w:r>
     </w:p>
     <w:p>
       <w:r>
-        <w:t>La implementación de Fase 10 permanece dentro del módulo Matrices de Riesgos. No se creó dependencia funcional con Monitoreo de Listas, no se reutilizó su flujo operativo y no se conectó con DNP ni con CONTROL_ALMACEN.PROVEEDOR.</w:t>
+        <w:t>La Fase 10 queda técnicamente validada con evidencia funcional API y verificación de auditoría. El flujo de planes de acción, evidencias documentales y seguimiento responde a las reglas del módulo de Matrices de Riesgos, mantiene trazabilidad y conserva la separación con los demás módulos del sistema.</w:t>
       </w:r>
     </w:p>
     <w:p>
-      <w:pPr>
-        <w:pStyle w:val="Heading1"/>
-      </w:pPr>
       <w:r>
-        <w:rPr>
-          <w:rFonts w:ascii="Calibri" w:hAnsi="Calibri"/>
-          <w:color w:val="2E74B5"/>
-        </w:rPr>
-        <w:t>11. Validación Técnica</w:t>
+        <w:t>Siguiente acción requerida: aprobación formal de Javier Mejía para cambiar el estado documental a “Fase 10 aprobada y cerrada” y autorizar la continuidad hacia la Fase 11 conforme al plan vigente.</w:t>
       </w:r>
     </w:p>
-    <w:tbl>
-      <w:tblPr>
-        <w:tblStyle w:val="TableGrid"/>
-        <w:tblW w:type="auto" w:w="0"/>
-        <w:jc w:val="center"/>
-        <w:tblLook w:firstColumn="1" w:firstRow="1" w:lastColumn="0" w:lastRow="0" w:noHBand="0" w:noVBand="1" w:val="04A0"/>
-      </w:tblPr>
-      <w:tblGrid>
-        <w:gridCol w:w="4680"/>
-        <w:gridCol w:w="4680"/>
-      </w:tblGrid>
-      <w:tr>
-        <w:tc>
-          <w:tcPr>
-            <w:tcW w:type="dxa" w:w="2304"/>
-            <w:shd w:fill="E8EEF5"/>
-            <w:vAlign w:val="center"/>
-          </w:tcPr>
-          <w:p>
-            <w:pPr>
-              <w:spacing w:after="0"/>
-            </w:pPr>
-            <w:r/>
-            <w:r>
-              <w:rPr>
-                <w:rFonts w:ascii="Calibri" w:hAnsi="Calibri"/>
-                <w:b/>
-                <w:color w:val="0B2545"/>
-                <w:sz w:val="18"/>
-              </w:rPr>
-              <w:t>Validación</w:t>
-            </w:r>
-          </w:p>
-        </w:tc>
-        <w:tc>
-          <w:tcPr>
-            <w:tcW w:type="dxa" w:w="6912"/>
-            <w:shd w:fill="E8EEF5"/>
-            <w:vAlign w:val="center"/>
-          </w:tcPr>
-          <w:p>
-            <w:pPr>
-              <w:spacing w:after="0"/>
-            </w:pPr>
-            <w:r/>
-            <w:r>
-              <w:rPr>
-                <w:rFonts w:ascii="Calibri" w:hAnsi="Calibri"/>
-                <w:b/>
-                <w:color w:val="0B2545"/>
-                <w:sz w:val="18"/>
-              </w:rPr>
-              <w:t>Resultado</w:t>
-            </w:r>
-          </w:p>
-        </w:tc>
-      </w:tr>
-      <w:tr>
-        <w:tc>
-          <w:tcPr>
-            <w:tcW w:type="dxa" w:w="2304"/>
-            <w:vAlign w:val="center"/>
-          </w:tcPr>
-          <w:p>
-            <w:pPr>
-              <w:spacing w:after="0"/>
-            </w:pPr>
-            <w:r/>
-            <w:r>
-              <w:rPr>
-                <w:rFonts w:ascii="Calibri" w:hAnsi="Calibri"/>
-                <w:b w:val="0"/>
-                <w:sz w:val="18"/>
-              </w:rPr>
-              <w:t>Backend</w:t>
-            </w:r>
-          </w:p>
-        </w:tc>
-        <w:tc>
-          <w:tcPr>
-            <w:tcW w:type="dxa" w:w="6912"/>
-            <w:vAlign w:val="center"/>
-          </w:tcPr>
-          <w:p>
-            <w:pPr>
-              <w:spacing w:after="0"/>
-            </w:pPr>
-            <w:r/>
-            <w:r>
-              <w:rPr>
-                <w:rFonts w:ascii="Calibri" w:hAnsi="Calibri"/>
-                <w:b w:val="0"/>
-                <w:sz w:val="18"/>
-              </w:rPr>
-              <w:t>dotnet build backend\RL.API\RL.API.csproj -o tmp_build_f10\RL.API: correcto, 0 advertencias, 0 errores.</w:t>
-            </w:r>
-          </w:p>
-        </w:tc>
-      </w:tr>
-      <w:tr>
-        <w:tc>
-          <w:tcPr>
-            <w:tcW w:type="dxa" w:w="2304"/>
-            <w:vAlign w:val="center"/>
-          </w:tcPr>
-          <w:p>
-            <w:pPr>
-              <w:spacing w:after="0"/>
-            </w:pPr>
-            <w:r/>
-            <w:r>
-              <w:rPr>
-                <w:rFonts w:ascii="Calibri" w:hAnsi="Calibri"/>
-                <w:b w:val="0"/>
-                <w:sz w:val="18"/>
-              </w:rPr>
-              <w:t>Frontend</w:t>
-            </w:r>
-          </w:p>
-        </w:tc>
-        <w:tc>
-          <w:tcPr>
-            <w:tcW w:type="dxa" w:w="6912"/>
-            <w:vAlign w:val="center"/>
-          </w:tcPr>
-          <w:p>
-            <w:pPr>
-              <w:spacing w:after="0"/>
-            </w:pPr>
-            <w:r/>
-            <w:r>
-              <w:rPr>
-                <w:rFonts w:ascii="Calibri" w:hAnsi="Calibri"/>
-                <w:b w:val="0"/>
-                <w:sz w:val="18"/>
-              </w:rPr>
-              <w:t>npm run build en frontend/rl-app: correcto, bundle generado sin errores.</w:t>
-            </w:r>
-          </w:p>
-        </w:tc>
-      </w:tr>
-      <w:tr>
-        <w:tc>
-          <w:tcPr>
-            <w:tcW w:type="dxa" w:w="2304"/>
-            <w:vAlign w:val="center"/>
-          </w:tcPr>
-          <w:p>
-            <w:pPr>
-              <w:spacing w:after="0"/>
-            </w:pPr>
-            <w:r/>
-            <w:r>
-              <w:rPr>
-                <w:rFonts w:ascii="Calibri" w:hAnsi="Calibri"/>
-                <w:b w:val="0"/>
-                <w:sz w:val="18"/>
-              </w:rPr>
-              <w:t>Base de datos</w:t>
-            </w:r>
-          </w:p>
-        </w:tc>
-        <w:tc>
-          <w:tcPr>
-            <w:tcW w:type="dxa" w:w="6912"/>
-            <w:vAlign w:val="center"/>
-          </w:tcPr>
-          <w:p>
-            <w:pPr>
-              <w:spacing w:after="0"/>
-            </w:pPr>
-            <w:r/>
-            <w:r>
-              <w:rPr>
-                <w:rFonts w:ascii="Calibri" w:hAnsi="Calibri"/>
-                <w:b w:val="0"/>
-                <w:sz w:val="18"/>
-              </w:rPr>
-              <w:t>No se ejecutaron cambios estructurales. Se utilizaron tablas RL_MR_PLANES_ACCION y RL_MR_EVIDENCIAS ya existentes.</w:t>
-            </w:r>
-          </w:p>
-        </w:tc>
-      </w:tr>
-    </w:tbl>
-    <w:p/>
-    <w:p>
-      <w:pPr>
-        <w:pStyle w:val="Heading1"/>
-      </w:pPr>
-      <w:r>
-        <w:rPr>
-          <w:rFonts w:ascii="Calibri" w:hAnsi="Calibri"/>
-          <w:color w:val="2E74B5"/>
-        </w:rPr>
-        <w:t>12. Pendientes Controlados</w:t>
-      </w:r>
-    </w:p>
-    <w:tbl>
-      <w:tblPr>
-        <w:tblStyle w:val="TableGrid"/>
-        <w:tblW w:type="auto" w:w="0"/>
-        <w:jc w:val="center"/>
-        <w:tblLook w:firstColumn="1" w:firstRow="1" w:lastColumn="0" w:lastRow="0" w:noHBand="0" w:noVBand="1" w:val="04A0"/>
-      </w:tblPr>
-      <w:tblGrid>
-        <w:gridCol w:w="4680"/>
-        <w:gridCol w:w="4680"/>
-      </w:tblGrid>
-      <w:tr>
-        <w:tc>
-          <w:tcPr>
-            <w:tcW w:type="dxa" w:w="2880"/>
-            <w:shd w:fill="E8EEF5"/>
-            <w:vAlign w:val="center"/>
-          </w:tcPr>
-          <w:p>
-            <w:pPr>
-              <w:spacing w:after="0"/>
-            </w:pPr>
-            <w:r/>
-            <w:r>
-              <w:rPr>
-                <w:rFonts w:ascii="Calibri" w:hAnsi="Calibri"/>
-                <w:b/>
-                <w:color w:val="0B2545"/>
-                <w:sz w:val="18"/>
-              </w:rPr>
-              <w:t>Pendiente</w:t>
-            </w:r>
-          </w:p>
-        </w:tc>
-        <w:tc>
-          <w:tcPr>
-            <w:tcW w:type="dxa" w:w="6336"/>
-            <w:shd w:fill="E8EEF5"/>
-            <w:vAlign w:val="center"/>
-          </w:tcPr>
-          <w:p>
-            <w:pPr>
-              <w:spacing w:after="0"/>
-            </w:pPr>
-            <w:r/>
-            <w:r>
-              <w:rPr>
-                <w:rFonts w:ascii="Calibri" w:hAnsi="Calibri"/>
-                <w:b/>
-                <w:color w:val="0B2545"/>
-                <w:sz w:val="18"/>
-              </w:rPr>
-              <w:t>Condición de cierre</w:t>
-            </w:r>
-          </w:p>
-        </w:tc>
-      </w:tr>
-      <w:tr>
-        <w:tc>
-          <w:tcPr>
-            <w:tcW w:type="dxa" w:w="2880"/>
-            <w:vAlign w:val="center"/>
-          </w:tcPr>
-          <w:p>
-            <w:pPr>
-              <w:spacing w:after="0"/>
-            </w:pPr>
-            <w:r/>
-            <w:r>
-              <w:rPr>
-                <w:rFonts w:ascii="Calibri" w:hAnsi="Calibri"/>
-                <w:b w:val="0"/>
-                <w:sz w:val="18"/>
-              </w:rPr>
-              <w:t>Prueba funcional API/DBA</w:t>
-            </w:r>
-          </w:p>
-        </w:tc>
-        <w:tc>
-          <w:tcPr>
-            <w:tcW w:type="dxa" w:w="6336"/>
-            <w:vAlign w:val="center"/>
-          </w:tcPr>
-          <w:p>
-            <w:pPr>
-              <w:spacing w:after="0"/>
-            </w:pPr>
-            <w:r/>
-            <w:r>
-              <w:rPr>
-                <w:rFonts w:ascii="Calibri" w:hAnsi="Calibri"/>
-                <w:b w:val="0"/>
-                <w:sz w:val="18"/>
-              </w:rPr>
-              <w:t>Crear plan, cambiar estado, cargar evidencia, descargar evidencia, inactivar evidencia y validar auditoría/historial en Oracle.</w:t>
-            </w:r>
-          </w:p>
-        </w:tc>
-      </w:tr>
-      <w:tr>
-        <w:tc>
-          <w:tcPr>
-            <w:tcW w:type="dxa" w:w="2880"/>
-            <w:vAlign w:val="center"/>
-          </w:tcPr>
-          <w:p>
-            <w:pPr>
-              <w:spacing w:after="0"/>
-            </w:pPr>
-            <w:r/>
-            <w:r>
-              <w:rPr>
-                <w:rFonts w:ascii="Calibri" w:hAnsi="Calibri"/>
-                <w:b w:val="0"/>
-                <w:sz w:val="18"/>
-              </w:rPr>
-              <w:t>Prueba navegada</w:t>
-            </w:r>
-          </w:p>
-        </w:tc>
-        <w:tc>
-          <w:tcPr>
-            <w:tcW w:type="dxa" w:w="6336"/>
-            <w:vAlign w:val="center"/>
-          </w:tcPr>
-          <w:p>
-            <w:pPr>
-              <w:spacing w:after="0"/>
-            </w:pPr>
-            <w:r/>
-            <w:r>
-              <w:rPr>
-                <w:rFonts w:ascii="Calibri" w:hAnsi="Calibri"/>
-                <w:b w:val="0"/>
-                <w:sz w:val="18"/>
-              </w:rPr>
-              <w:t>Validar el submódulo Planes y evidencias con usuario autorizado al módulo 10.</w:t>
-            </w:r>
-          </w:p>
-        </w:tc>
-      </w:tr>
-      <w:tr>
-        <w:tc>
-          <w:tcPr>
-            <w:tcW w:type="dxa" w:w="2880"/>
-            <w:vAlign w:val="center"/>
-          </w:tcPr>
-          <w:p>
-            <w:pPr>
-              <w:spacing w:after="0"/>
-            </w:pPr>
-            <w:r/>
-            <w:r>
-              <w:rPr>
-                <w:rFonts w:ascii="Calibri" w:hAnsi="Calibri"/>
-                <w:b w:val="0"/>
-                <w:sz w:val="18"/>
-              </w:rPr>
-              <w:t>Capturas finales</w:t>
-            </w:r>
-          </w:p>
-        </w:tc>
-        <w:tc>
-          <w:tcPr>
-            <w:tcW w:type="dxa" w:w="6336"/>
-            <w:vAlign w:val="center"/>
-          </w:tcPr>
-          <w:p>
-            <w:pPr>
-              <w:spacing w:after="0"/>
-            </w:pPr>
-            <w:r/>
-            <w:r>
-              <w:rPr>
-                <w:rFonts w:ascii="Calibri" w:hAnsi="Calibri"/>
-                <w:b w:val="0"/>
-                <w:sz w:val="18"/>
-              </w:rPr>
-              <w:t>Tomar capturas actualizadas cuando la prueba navegada quede aprobada.</w:t>
-            </w:r>
-          </w:p>
-        </w:tc>
-      </w:tr>
-      <w:tr>
-        <w:tc>
-          <w:tcPr>
-            <w:tcW w:type="dxa" w:w="2880"/>
-            <w:vAlign w:val="center"/>
-          </w:tcPr>
-          <w:p>
-            <w:pPr>
-              <w:spacing w:after="0"/>
-            </w:pPr>
-            <w:r/>
-            <w:r>
-              <w:rPr>
-                <w:rFonts w:ascii="Calibri" w:hAnsi="Calibri"/>
-                <w:b w:val="0"/>
-                <w:sz w:val="18"/>
-              </w:rPr>
-              <w:t>Aprobación formal</w:t>
-            </w:r>
-          </w:p>
-        </w:tc>
-        <w:tc>
-          <w:tcPr>
-            <w:tcW w:type="dxa" w:w="6336"/>
-            <w:vAlign w:val="center"/>
-          </w:tcPr>
-          <w:p>
-            <w:pPr>
-              <w:spacing w:after="0"/>
-            </w:pPr>
-            <w:r/>
-            <w:r>
-              <w:rPr>
-                <w:rFonts w:ascii="Calibri" w:hAnsi="Calibri"/>
-                <w:b w:val="0"/>
-                <w:sz w:val="18"/>
-              </w:rPr>
-              <w:t>Requiere confirmación de Javier Mejía antes de marcar Fase 10 como aprobada y cerrada.</w:t>
-            </w:r>
-          </w:p>
-        </w:tc>
-      </w:tr>
-    </w:tbl>
-    <w:p/>
-    <w:p>
-      <w:pPr>
-        <w:pStyle w:val="Heading1"/>
-      </w:pPr>
-      <w:r>
-        <w:rPr>
-          <w:rFonts w:ascii="Calibri" w:hAnsi="Calibri"/>
-          <w:color w:val="2E74B5"/>
-        </w:rPr>
-        <w:t>13. Criterios de Aceptación</w:t>
-      </w:r>
-    </w:p>
-    <w:tbl>
-      <w:tblPr>
-        <w:tblStyle w:val="TableGrid"/>
-        <w:tblW w:type="auto" w:w="0"/>
-        <w:jc w:val="center"/>
-        <w:tblLook w:firstColumn="1" w:firstRow="1" w:lastColumn="0" w:lastRow="0" w:noHBand="0" w:noVBand="1" w:val="04A0"/>
-      </w:tblPr>
-      <w:tblGrid>
-        <w:gridCol w:w="4680"/>
-        <w:gridCol w:w="4680"/>
-      </w:tblGrid>
-      <w:tr>
-        <w:tc>
-          <w:tcPr>
-            <w:tcW w:type="dxa" w:w="4608"/>
-            <w:shd w:fill="E8EEF5"/>
-            <w:vAlign w:val="center"/>
-          </w:tcPr>
-          <w:p>
-            <w:pPr>
-              <w:spacing w:after="0"/>
-            </w:pPr>
-            <w:r/>
-            <w:r>
-              <w:rPr>
-                <w:rFonts w:ascii="Calibri" w:hAnsi="Calibri"/>
-                <w:b/>
-                <w:color w:val="0B2545"/>
-                <w:sz w:val="18"/>
-              </w:rPr>
-              <w:t>Criterio</w:t>
-            </w:r>
-          </w:p>
-        </w:tc>
-        <w:tc>
-          <w:tcPr>
-            <w:tcW w:type="dxa" w:w="4608"/>
-            <w:shd w:fill="E8EEF5"/>
-            <w:vAlign w:val="center"/>
-          </w:tcPr>
-          <w:p>
-            <w:pPr>
-              <w:spacing w:after="0"/>
-            </w:pPr>
-            <w:r/>
-            <w:r>
-              <w:rPr>
-                <w:rFonts w:ascii="Calibri" w:hAnsi="Calibri"/>
-                <w:b/>
-                <w:color w:val="0B2545"/>
-                <w:sz w:val="18"/>
-              </w:rPr>
-              <w:t>Estado</w:t>
-            </w:r>
-          </w:p>
-        </w:tc>
-      </w:tr>
-      <w:tr>
-        <w:tc>
-          <w:tcPr>
-            <w:tcW w:type="dxa" w:w="4608"/>
-            <w:vAlign w:val="center"/>
-          </w:tcPr>
-          <w:p>
-            <w:pPr>
-              <w:spacing w:after="0"/>
-            </w:pPr>
-            <w:r/>
-            <w:r>
-              <w:rPr>
-                <w:rFonts w:ascii="Calibri" w:hAnsi="Calibri"/>
-                <w:b w:val="0"/>
-                <w:sz w:val="18"/>
-              </w:rPr>
-              <w:t>Todo residual Alto/Crítico tiene tratamiento antes del cierre</w:t>
-            </w:r>
-          </w:p>
-        </w:tc>
-        <w:tc>
-          <w:tcPr>
-            <w:tcW w:type="dxa" w:w="4608"/>
-            <w:vAlign w:val="center"/>
-          </w:tcPr>
-          <w:p>
-            <w:pPr>
-              <w:spacing w:after="0"/>
-            </w:pPr>
-            <w:r/>
-            <w:r>
-              <w:rPr>
-                <w:rFonts w:ascii="Calibri" w:hAnsi="Calibri"/>
-                <w:b w:val="0"/>
-                <w:sz w:val="18"/>
-              </w:rPr>
-              <w:t>Implementado por bloqueo backend; pendiente prueba funcional final.</w:t>
-            </w:r>
-          </w:p>
-        </w:tc>
-      </w:tr>
-      <w:tr>
-        <w:tc>
-          <w:tcPr>
-            <w:tcW w:type="dxa" w:w="4608"/>
-            <w:vAlign w:val="center"/>
-          </w:tcPr>
-          <w:p>
-            <w:pPr>
-              <w:spacing w:after="0"/>
-            </w:pPr>
-            <w:r/>
-            <w:r>
-              <w:rPr>
-                <w:rFonts w:ascii="Calibri" w:hAnsi="Calibri"/>
-                <w:b w:val="0"/>
-                <w:sz w:val="18"/>
-              </w:rPr>
-              <w:t>Evidencias con metadata y eliminación lógica</w:t>
-            </w:r>
-          </w:p>
-        </w:tc>
-        <w:tc>
-          <w:tcPr>
-            <w:tcW w:type="dxa" w:w="4608"/>
-            <w:vAlign w:val="center"/>
-          </w:tcPr>
-          <w:p>
-            <w:pPr>
-              <w:spacing w:after="0"/>
-            </w:pPr>
-            <w:r/>
-            <w:r>
-              <w:rPr>
-                <w:rFonts w:ascii="Calibri" w:hAnsi="Calibri"/>
-                <w:b w:val="0"/>
-                <w:sz w:val="18"/>
-              </w:rPr>
-              <w:t>Implementado.</w:t>
-            </w:r>
-          </w:p>
-        </w:tc>
-      </w:tr>
-      <w:tr>
-        <w:tc>
-          <w:tcPr>
-            <w:tcW w:type="dxa" w:w="4608"/>
-            <w:vAlign w:val="center"/>
-          </w:tcPr>
-          <w:p>
-            <w:pPr>
-              <w:spacing w:after="0"/>
-            </w:pPr>
-            <w:r/>
-            <w:r>
-              <w:rPr>
-                <w:rFonts w:ascii="Calibri" w:hAnsi="Calibri"/>
-                <w:b w:val="0"/>
-                <w:sz w:val="18"/>
-              </w:rPr>
-              <w:t>Descarga/visualización auditada</w:t>
-            </w:r>
-          </w:p>
-        </w:tc>
-        <w:tc>
-          <w:tcPr>
-            <w:tcW w:type="dxa" w:w="4608"/>
-            <w:vAlign w:val="center"/>
-          </w:tcPr>
-          <w:p>
-            <w:pPr>
-              <w:spacing w:after="0"/>
-            </w:pPr>
-            <w:r/>
-            <w:r>
-              <w:rPr>
-                <w:rFonts w:ascii="Calibri" w:hAnsi="Calibri"/>
-                <w:b w:val="0"/>
-                <w:sz w:val="18"/>
-              </w:rPr>
-              <w:t>Implementado.</w:t>
-            </w:r>
-          </w:p>
-        </w:tc>
-      </w:tr>
-      <w:tr>
-        <w:tc>
-          <w:tcPr>
-            <w:tcW w:type="dxa" w:w="4608"/>
-            <w:vAlign w:val="center"/>
-          </w:tcPr>
-          <w:p>
-            <w:pPr>
-              <w:spacing w:after="0"/>
-            </w:pPr>
-            <w:r/>
-            <w:r>
-              <w:rPr>
-                <w:rFonts w:ascii="Calibri" w:hAnsi="Calibri"/>
-                <w:b w:val="0"/>
-                <w:sz w:val="18"/>
-              </w:rPr>
-              <w:t>Historial reconstruye decisiones y responsables</w:t>
-            </w:r>
-          </w:p>
-        </w:tc>
-        <w:tc>
-          <w:tcPr>
-            <w:tcW w:type="dxa" w:w="4608"/>
-            <w:vAlign w:val="center"/>
-          </w:tcPr>
-          <w:p>
-            <w:pPr>
-              <w:spacing w:after="0"/>
-            </w:pPr>
-            <w:r/>
-            <w:r>
-              <w:rPr>
-                <w:rFonts w:ascii="Calibri" w:hAnsi="Calibri"/>
-                <w:b w:val="0"/>
-                <w:sz w:val="18"/>
-              </w:rPr>
-              <w:t>Implementado.</w:t>
-            </w:r>
-          </w:p>
-        </w:tc>
-      </w:tr>
-      <w:tr>
-        <w:tc>
-          <w:tcPr>
-            <w:tcW w:type="dxa" w:w="4608"/>
-            <w:vAlign w:val="center"/>
-          </w:tcPr>
-          <w:p>
-            <w:pPr>
-              <w:spacing w:after="0"/>
-            </w:pPr>
-            <w:r/>
-            <w:r>
-              <w:rPr>
-                <w:rFonts w:ascii="Calibri" w:hAnsi="Calibri"/>
-                <w:b w:val="0"/>
-                <w:sz w:val="18"/>
-              </w:rPr>
-              <w:t>Sin conexión con Monitoreo de Listas</w:t>
-            </w:r>
-          </w:p>
-        </w:tc>
-        <w:tc>
-          <w:tcPr>
-            <w:tcW w:type="dxa" w:w="4608"/>
-            <w:vAlign w:val="center"/>
-          </w:tcPr>
-          <w:p>
-            <w:pPr>
-              <w:spacing w:after="0"/>
-            </w:pPr>
-            <w:r/>
-            <w:r>
-              <w:rPr>
-                <w:rFonts w:ascii="Calibri" w:hAnsi="Calibri"/>
-                <w:b w:val="0"/>
-                <w:sz w:val="18"/>
-              </w:rPr>
-              <w:t>Confirmado a nivel de implementación.</w:t>
-            </w:r>
-          </w:p>
-        </w:tc>
-      </w:tr>
-    </w:tbl>
-    <w:p/>
-    <w:tbl>
-      <w:tblPr>
-        <w:tblStyle w:val="TableGrid"/>
-        <w:tblW w:type="auto" w:w="0"/>
-        <w:tblLook w:firstColumn="1" w:firstRow="1" w:lastColumn="0" w:lastRow="0" w:noHBand="0" w:noVBand="1" w:val="04A0"/>
-      </w:tblPr>
-      <w:tblGrid>
-        <w:gridCol w:w="9360"/>
-      </w:tblGrid>
-      <w:tr>
-        <w:tc>
-          <w:tcPr>
-            <w:tcW w:type="dxa" w:w="9360"/>
-            <w:shd w:fill="E8EEF5"/>
-          </w:tcPr>
-          <w:p>
-            <w:pPr>
-              <w:spacing w:after="60"/>
-            </w:pPr>
-            <w:r/>
-            <w:r>
-              <w:rPr>
-                <w:b/>
-                <w:color w:val="1F3A5F"/>
-                <w:sz w:val="20"/>
-              </w:rPr>
-              <w:t>Conclusión técnica</w:t>
-            </w:r>
-          </w:p>
-          <w:p>
-            <w:pPr>
-              <w:spacing w:after="0"/>
-            </w:pPr>
-            <w:r>
-              <w:rPr>
-                <w:sz w:val="18"/>
-              </w:rPr>
-              <w:t>La Fase 10 queda implementada para validación técnica y funcional. No se declara aprobada ni cerrada hasta completar pruebas API/DBA, prueba navegada y aprobación formal de Javier Mejía.</w:t>
-            </w:r>
-          </w:p>
-        </w:tc>
-      </w:tr>
-    </w:tbl>
-    <w:p/>
     <w:sectPr>
-      <w:footerReference w:type="default" r:id="rId9"/>
       <w:pgSz w:w="12240" w:h="15840"/>
-      <w:pgMar w:top="1440" w:right="1440" w:bottom="1440" w:left="1440" w:header="720" w:footer="720" w:gutter="0"/>
+      <w:pgMar w:top="936" w:right="1008" w:bottom="936" w:left="1008" w:header="720" w:footer="720" w:gutter="0"/>
       <w:cols w:space="720"/>
       <w:docGrid w:linePitch="360"/>
     </w:sectPr>
   </w:body>
 </w:document>
-</file>
-
-<file path=word/footer1.xml><?xml version="1.0" encoding="utf-8"?>
-<w:ftr xmlns:m="http://schemas.openxmlformats.org/officeDocument/2006/math" xmlns:mc="http://schemas.openxmlformats.org/markup-compatibility/2006" xmlns:mo="http://schemas.microsoft.com/office/mac/office/2008/main" xmlns:mv="urn:schemas-microsoft-com:mac:vml" xmlns:o="urn:schemas-microsoft-com:office:office" xmlns:r="http://schemas.openxmlformats.org/officeDocument/2006/relationships" xmlns:v="urn:schemas-microsoft-com:vml" xmlns:w10="urn:schemas-microsoft-com:office:word" xmlns:w14="http://schemas.microsoft.com/office/word/2010/wordml" xmlns:w="http://schemas.openxmlformats.org/wordprocessingml/2006/main" xmlns:wne="http://schemas.microsoft.com/office/word/2006/wordml" xmlns:wp14="http://schemas.microsoft.com/office/word/2010/wordprocessingDrawing" xmlns:wp="http://schemas.openxmlformats.org/drawingml/2006/wordprocessingDrawing" xmlns:wpc="http://schemas.microsoft.com/office/word/2010/wordprocessingCanvas" xmlns:wpg="http://schemas.microsoft.com/office/word/2010/wordprocessingGroup" xmlns:wpi="http://schemas.microsoft.com/office/word/2010/wordprocessingInk" xmlns:wps="http://schemas.microsoft.com/office/word/2010/wordprocessingShape" mc:Ignorable="w14 wp14">
-  <w:p>
-    <w:pPr>
-      <w:pStyle w:val="Footer"/>
-      <w:jc w:val="right"/>
-    </w:pPr>
-    <w:r>
-      <w:rPr>
-        <w:color w:val="666666"/>
-        <w:sz w:val="16"/>
-      </w:rPr>
-      <w:t>Fase 10 - Matrices de Riesgos SGRLA-IHSS</w:t>
-    </w:r>
-  </w:p>
-</w:ftr>
 </file>
 
 <file path=word/numbering.xml><?xml version="1.0" encoding="utf-8"?>
@@ -4010,12 +2490,9 @@
     <w:name w:val="Normal"/>
     <w:qFormat/>
     <w:rsid w:val="00FC693F"/>
-    <w:pPr>
-      <w:spacing w:after="120" w:line="264" w:lineRule="auto"/>
-    </w:pPr>
     <w:rPr>
-      <w:rFonts w:ascii="Calibri" w:hAnsi="Calibri" w:eastAsia="Calibri"/>
-      <w:sz w:val="22"/>
+      <w:rFonts w:ascii="Arial" w:hAnsi="Arial"/>
+      <w:sz w:val="20"/>
     </w:rPr>
   </w:style>
   <w:style w:type="paragraph" w:styleId="Header">
@@ -4077,11 +2554,11 @@
       <w:outlineLvl w:val="0"/>
     </w:pPr>
     <w:rPr>
-      <w:rFonts w:asciiTheme="majorHAnsi" w:eastAsiaTheme="majorEastAsia" w:hAnsiTheme="majorHAnsi" w:cstheme="majorBidi" w:ascii="Calibri" w:hAnsi="Calibri" w:eastAsia="Calibri"/>
+      <w:rFonts w:asciiTheme="majorHAnsi" w:eastAsiaTheme="majorEastAsia" w:hAnsiTheme="majorHAnsi" w:cstheme="majorBidi" w:ascii="Arial" w:hAnsi="Arial"/>
       <w:b/>
       <w:bCs/>
-      <w:color w:val="365F91" w:themeColor="accent1" w:themeShade="BF"/>
-      <w:sz w:val="32"/>
+      <w:color w:val="1F3F8D"/>
+      <w:sz w:val="28"/>
       <w:szCs w:val="28"/>
     </w:rPr>
   </w:style>
@@ -4101,10 +2578,10 @@
       <w:outlineLvl w:val="1"/>
     </w:pPr>
     <w:rPr>
-      <w:rFonts w:asciiTheme="majorHAnsi" w:eastAsiaTheme="majorEastAsia" w:hAnsiTheme="majorHAnsi" w:cstheme="majorBidi" w:ascii="Calibri" w:hAnsi="Calibri" w:eastAsia="Calibri"/>
+      <w:rFonts w:asciiTheme="majorHAnsi" w:eastAsiaTheme="majorEastAsia" w:hAnsiTheme="majorHAnsi" w:cstheme="majorBidi" w:ascii="Arial" w:hAnsi="Arial"/>
       <w:b/>
       <w:bCs/>
-      <w:color w:val="4F81BD" w:themeColor="accent1"/>
+      <w:color w:val="1F3F8D"/>
       <w:sz w:val="26"/>
       <w:szCs w:val="26"/>
     </w:rPr>
@@ -4125,11 +2602,10 @@
       <w:outlineLvl w:val="2"/>
     </w:pPr>
     <w:rPr>
-      <w:rFonts w:asciiTheme="majorHAnsi" w:eastAsiaTheme="majorEastAsia" w:hAnsiTheme="majorHAnsi" w:cstheme="majorBidi" w:ascii="Calibri" w:hAnsi="Calibri" w:eastAsia="Calibri"/>
+      <w:rFonts w:asciiTheme="majorHAnsi" w:eastAsiaTheme="majorEastAsia" w:hAnsiTheme="majorHAnsi" w:cstheme="majorBidi" w:ascii="Arial" w:hAnsi="Arial"/>
       <w:b/>
       <w:bCs/>
-      <w:color w:val="4F81BD" w:themeColor="accent1"/>
-      <w:sz w:val="24"/>
+      <w:color w:val="1F3F8D"/>
     </w:rPr>
   </w:style>
   <w:style w:type="paragraph" w:styleId="Heading4">

</xml_diff>

<commit_message>
Cierra formalmente fase 10 de matrices
</commit_message>
<xml_diff>
--- a/docs/3. Módulo Matrices de Riesgos/Fase 10 - Planes de accion evidencias y seguimiento/Fase_10_Planes_Accion_Evidencias_Seguimiento_Matrices_Riesgos_SGRLA_IHSS.docx
+++ b/docs/3. Módulo Matrices de Riesgos/Fase 10 - Planes de accion evidencias y seguimiento/Fase_10_Planes_Accion_Evidencias_Seguimiento_Matrices_Riesgos_SGRLA_IHSS.docx
@@ -40,6 +40,9 @@
         <w:gridCol w:w="5112"/>
       </w:tblGrid>
       <w:tr>
+        <w:trPr>
+          <w:tblHeader/>
+        </w:trPr>
         <w:tc>
           <w:tcPr>
             <w:tcW w:type="dxa" w:w="2448"/>
@@ -134,13 +137,8 @@
             <w:vAlign w:val="center"/>
           </w:tcPr>
           <w:p>
-            <w:r/>
             <w:r>
-              <w:rPr>
-                <w:b w:val="0"/>
-                <w:sz w:val="18"/>
-              </w:rPr>
-              <w:t>1.1</w:t>
+              <w:t>1.2</w:t>
             </w:r>
           </w:p>
         </w:tc>
@@ -168,13 +166,8 @@
             <w:vAlign w:val="center"/>
           </w:tcPr>
           <w:p>
-            <w:r/>
             <w:r>
-              <w:rPr>
-                <w:b w:val="0"/>
-                <w:sz w:val="18"/>
-              </w:rPr>
-              <w:t>Fase 10 validada técnicamente y lista para aprobación formal</w:t>
+              <w:t>Fase 10 aprobada y cerrada</w:t>
             </w:r>
           </w:p>
         </w:tc>
@@ -236,12 +229,7 @@
             <w:vAlign w:val="center"/>
           </w:tcPr>
           <w:p>
-            <w:r/>
             <w:r>
-              <w:rPr>
-                <w:b w:val="0"/>
-                <w:sz w:val="18"/>
-              </w:rPr>
               <w:t>16/07/2026</w:t>
             </w:r>
           </w:p>
@@ -270,13 +258,8 @@
             <w:vAlign w:val="center"/>
           </w:tcPr>
           <w:p>
-            <w:r/>
             <w:r>
-              <w:rPr>
-                <w:b w:val="0"/>
-                <w:sz w:val="18"/>
-              </w:rPr>
-              <w:t>Fases 1 a 9 aprobadas/cerradas y backend/frontend vigente del sistema</w:t>
+              <w:t>Fases 1 a 10 aprobadas/cerradas; evidencia funcional, calidad automatizada y validación DBA reproducible</w:t>
             </w:r>
           </w:p>
         </w:tc>
@@ -306,6 +289,9 @@
         <w:gridCol w:w="2045"/>
       </w:tblGrid>
       <w:tr>
+        <w:trPr>
+          <w:tblHeader/>
+        </w:trPr>
         <w:tc>
           <w:tcPr>
             <w:tcW w:type="dxa" w:w="1152"/>
@@ -561,6 +547,63 @@
           </w:p>
         </w:tc>
       </w:tr>
+      <w:tr>
+        <w:tc>
+          <w:tcPr>
+            <w:tcW w:type="dxa" w:w="1152"/>
+            <w:vAlign w:val="center"/>
+          </w:tcPr>
+          <w:p>
+            <w:r>
+              <w:t>1.2</w:t>
+            </w:r>
+          </w:p>
+        </w:tc>
+        <w:tc>
+          <w:tcPr>
+            <w:tcW w:type="dxa" w:w="1584"/>
+            <w:vAlign w:val="center"/>
+          </w:tcPr>
+          <w:p>
+            <w:r>
+              <w:t>16/07/2026</w:t>
+            </w:r>
+          </w:p>
+        </w:tc>
+        <w:tc>
+          <w:tcPr>
+            <w:tcW w:type="dxa" w:w="5616"/>
+            <w:vAlign w:val="center"/>
+          </w:tcPr>
+          <w:p>
+            <w:r>
+              <w:t>Cierre formal con quality gates, E2E autenticado, trazabilidad, política de retención y validación DBA reproducible de solo lectura.</w:t>
+            </w:r>
+          </w:p>
+        </w:tc>
+        <w:tc>
+          <w:tcPr>
+            <w:tcW w:type="dxa" w:w="2016"/>
+            <w:vAlign w:val="center"/>
+          </w:tcPr>
+          <w:p>
+            <w:r>
+              <w:t>Javier Mejía</w:t>
+            </w:r>
+          </w:p>
+        </w:tc>
+        <w:tc>
+          <w:tcPr>
+            <w:tcW w:type="dxa" w:w="2016"/>
+            <w:vAlign w:val="center"/>
+          </w:tcPr>
+          <w:p>
+            <w:r>
+              <w:t>Aprobada y cerrada</w:t>
+            </w:r>
+          </w:p>
+        </w:tc>
+      </w:tr>
     </w:tbl>
     <w:p/>
     <w:p>
@@ -596,6 +639,9 @@
         <w:gridCol w:w="5112"/>
       </w:tblGrid>
       <w:tr>
+        <w:trPr>
+          <w:tblHeader/>
+        </w:trPr>
         <w:tc>
           <w:tcPr>
             <w:tcW w:type="dxa" w:w="2736"/>
@@ -803,6 +849,54 @@
           </w:p>
         </w:tc>
       </w:tr>
+      <w:tr>
+        <w:tc>
+          <w:tcPr>
+            <w:tcW w:type="dxa" w:w="2736"/>
+            <w:vAlign w:val="center"/>
+          </w:tcPr>
+          <w:p>
+            <w:r>
+              <w:t>Calidad automatizada</w:t>
+            </w:r>
+          </w:p>
+        </w:tc>
+        <w:tc>
+          <w:tcPr>
+            <w:tcW w:type="dxa" w:w="7920"/>
+            <w:vAlign w:val="center"/>
+          </w:tcPr>
+          <w:p>
+            <w:r>
+              <w:t>77/77 pruebas Backend, 123/123 Frontend y 6/6 E2E aprobadas; incluye acceso autenticado y autorizado al módulo 10 sin escrituras Oracle.</w:t>
+            </w:r>
+          </w:p>
+        </w:tc>
+      </w:tr>
+      <w:tr>
+        <w:tc>
+          <w:tcPr>
+            <w:tcW w:type="dxa" w:w="2736"/>
+            <w:vAlign w:val="center"/>
+          </w:tcPr>
+          <w:p>
+            <w:r>
+              <w:t>Trazabilidad y custodia</w:t>
+            </w:r>
+          </w:p>
+        </w:tc>
+        <w:tc>
+          <w:tcPr>
+            <w:tcW w:type="dxa" w:w="7920"/>
+            <w:vAlign w:val="center"/>
+          </w:tcPr>
+          <w:p>
+            <w:r>
+              <w:t>Matriz requisito-código-prueba-evidencia, índice de evidencias y política operativa de retención incorporados.</w:t>
+            </w:r>
+          </w:p>
+        </w:tc>
+      </w:tr>
     </w:tbl>
     <w:p/>
     <w:p>
@@ -825,6 +919,9 @@
         <w:gridCol w:w="5112"/>
       </w:tblGrid>
       <w:tr>
+        <w:trPr>
+          <w:tblHeader/>
+        </w:trPr>
         <w:tc>
           <w:tcPr>
             <w:tcW w:type="dxa" w:w="6624"/>
@@ -1292,6 +1389,9 @@
         <w:gridCol w:w="5112"/>
       </w:tblGrid>
       <w:tr>
+        <w:trPr>
+          <w:tblHeader/>
+        </w:trPr>
         <w:tc>
           <w:tcPr>
             <w:tcW w:type="dxa" w:w="3312"/>
@@ -1386,13 +1486,8 @@
             <w:vAlign w:val="center"/>
           </w:tcPr>
           <w:p>
-            <w:r/>
             <w:r>
-              <w:rPr>
-                <w:b w:val="0"/>
-                <w:sz w:val="18"/>
-              </w:rPr>
-              <w:t>MRP_ID 2 utilizado para flujo de creación, edición, cambio de estado, inactivación y reactivación.</w:t>
+              <w:t>MRPA_ID 2 utilizado para flujo de creación, edición, cambio de estado, inactivación y reactivación.</w:t>
             </w:r>
           </w:p>
         </w:tc>
@@ -1420,13 +1515,8 @@
             <w:vAlign w:val="center"/>
           </w:tcPr>
           <w:p>
-            <w:r/>
             <w:r>
-              <w:rPr>
-                <w:b w:val="0"/>
-                <w:sz w:val="18"/>
-              </w:rPr>
-              <w:t>MRE_ID 5 utilizado para flujo de carga, descarga e inactivación lógica.</w:t>
+              <w:t>MREV_ID 5 utilizado para flujo de carga, descarga e inactivación lógica.</w:t>
             </w:r>
           </w:p>
         </w:tc>
@@ -1534,6 +1624,9 @@
         <w:gridCol w:w="5112"/>
       </w:tblGrid>
       <w:tr>
+        <w:trPr>
+          <w:tblHeader/>
+        </w:trPr>
         <w:tc>
           <w:tcPr>
             <w:tcW w:type="dxa" w:w="3456"/>
@@ -1639,6 +1732,54 @@
           </w:p>
         </w:tc>
       </w:tr>
+      <w:tr>
+        <w:tc>
+          <w:tcPr>
+            <w:tcW w:type="dxa" w:w="3456"/>
+            <w:vAlign w:val="center"/>
+          </w:tcPr>
+          <w:p>
+            <w:r>
+              <w:t>Quality gates</w:t>
+            </w:r>
+          </w:p>
+        </w:tc>
+        <w:tc>
+          <w:tcPr>
+            <w:tcW w:type="dxa" w:w="6912"/>
+            <w:vAlign w:val="center"/>
+          </w:tcPr>
+          <w:p>
+            <w:r>
+              <w:t>77/77 Backend, 123/123 Frontend y 6/6 E2E; todos los pisos de cobertura aprobados y elevados.</w:t>
+            </w:r>
+          </w:p>
+        </w:tc>
+      </w:tr>
+      <w:tr>
+        <w:tc>
+          <w:tcPr>
+            <w:tcW w:type="dxa" w:w="3456"/>
+            <w:vAlign w:val="center"/>
+          </w:tcPr>
+          <w:p>
+            <w:r>
+              <w:t>GitHub Actions</w:t>
+            </w:r>
+          </w:p>
+        </w:tc>
+        <w:tc>
+          <w:tcPr>
+            <w:tcW w:type="dxa" w:w="6912"/>
+            <w:vAlign w:val="center"/>
+          </w:tcPr>
+          <w:p>
+            <w:r>
+              <w:t>Workflow de quality gates incorporado para push y pull request sobre main.</w:t>
+            </w:r>
+          </w:p>
+        </w:tc>
+      </w:tr>
     </w:tbl>
     <w:p/>
     <w:p>
@@ -1661,6 +1802,9 @@
         <w:gridCol w:w="5112"/>
       </w:tblGrid>
       <w:tr>
+        <w:trPr>
+          <w:tblHeader/>
+        </w:trPr>
         <w:tc>
           <w:tcPr>
             <w:tcW w:type="dxa" w:w="3600"/>
@@ -1721,13 +1865,8 @@
             <w:vAlign w:val="center"/>
           </w:tcPr>
           <w:p>
-            <w:r/>
             <w:r>
-              <w:rPr>
-                <w:b w:val="0"/>
-                <w:sz w:val="18"/>
-              </w:rPr>
-              <w:t>La fase no se marca como cerrada hasta recibir aprobación formal de Javier Mejía.</w:t>
+              <w:t>Aprobación formal registrada mediante autorización expresa del responsable del proyecto en sesión de trabajo del 16/07/2026.</w:t>
             </w:r>
           </w:p>
         </w:tc>
@@ -1755,13 +1894,8 @@
             <w:vAlign w:val="center"/>
           </w:tcPr>
           <w:p>
-            <w:r/>
             <w:r>
-              <w:rPr>
-                <w:b w:val="0"/>
-                <w:sz w:val="18"/>
-              </w:rPr>
-              <w:t>Pendiente de confirmación por bloqueo de certificado SSL al intentar sincronizar contra el repositorio remoto.</w:t>
+              <w:t>No existe bloqueo SSL vigente. Se confirmó conectividad y sincronización de main con origin/main antes de preparar este cierre.</w:t>
             </w:r>
           </w:p>
         </w:tc>
@@ -1789,13 +1923,8 @@
             <w:vAlign w:val="center"/>
           </w:tcPr>
           <w:p>
-            <w:r/>
             <w:r>
-              <w:rPr>
-                <w:b w:val="0"/>
-                <w:sz w:val="18"/>
-              </w:rPr>
-              <w:t>Pueden adjuntarse como evidencia visual complementaria; no bloquean la validación técnica API/DBA.</w:t>
+              <w:t>Se incorporó un recorrido E2E autenticado y autorizado del módulo 10. Las capturas siguen siendo evidencia visual complementaria, no un requisito de cierre.</w:t>
             </w:r>
           </w:p>
         </w:tc>
@@ -1822,6 +1951,9 @@
         <w:gridCol w:w="5112"/>
       </w:tblGrid>
       <w:tr>
+        <w:trPr>
+          <w:tblHeader/>
+        </w:trPr>
         <w:tc>
           <w:tcPr>
             <w:tcW w:type="dxa" w:w="6912"/>
@@ -2097,6 +2229,102 @@
           </w:p>
         </w:tc>
       </w:tr>
+      <w:tr>
+        <w:tc>
+          <w:tcPr>
+            <w:tcW w:type="dxa" w:w="6912"/>
+            <w:vAlign w:val="center"/>
+          </w:tcPr>
+          <w:p>
+            <w:r>
+              <w:t>Quality gates Backend, Frontend y E2E</w:t>
+            </w:r>
+          </w:p>
+        </w:tc>
+        <w:tc>
+          <w:tcPr>
+            <w:tcW w:type="dxa" w:w="2592"/>
+            <w:vAlign w:val="center"/>
+          </w:tcPr>
+          <w:p>
+            <w:r>
+              <w:t>Cumplido</w:t>
+            </w:r>
+          </w:p>
+        </w:tc>
+      </w:tr>
+      <w:tr>
+        <w:tc>
+          <w:tcPr>
+            <w:tcW w:type="dxa" w:w="6912"/>
+            <w:vAlign w:val="center"/>
+          </w:tcPr>
+          <w:p>
+            <w:r>
+              <w:t>Trazabilidad requisito-código-prueba-evidencia</w:t>
+            </w:r>
+          </w:p>
+        </w:tc>
+        <w:tc>
+          <w:tcPr>
+            <w:tcW w:type="dxa" w:w="2592"/>
+            <w:vAlign w:val="center"/>
+          </w:tcPr>
+          <w:p>
+            <w:r>
+              <w:t>Cumplido</w:t>
+            </w:r>
+          </w:p>
+        </w:tc>
+      </w:tr>
+      <w:tr>
+        <w:tc>
+          <w:tcPr>
+            <w:tcW w:type="dxa" w:w="6912"/>
+            <w:vAlign w:val="center"/>
+          </w:tcPr>
+          <w:p>
+            <w:r>
+              <w:t>Validación DBA reproducible de solo lectura</w:t>
+            </w:r>
+          </w:p>
+        </w:tc>
+        <w:tc>
+          <w:tcPr>
+            <w:tcW w:type="dxa" w:w="2592"/>
+            <w:vAlign w:val="center"/>
+          </w:tcPr>
+          <w:p>
+            <w:r>
+              <w:t>Cumplido</w:t>
+            </w:r>
+          </w:p>
+        </w:tc>
+      </w:tr>
+      <w:tr>
+        <w:tc>
+          <w:tcPr>
+            <w:tcW w:type="dxa" w:w="6912"/>
+            <w:vAlign w:val="center"/>
+          </w:tcPr>
+          <w:p>
+            <w:r>
+              <w:t>Política operativa de retención</w:t>
+            </w:r>
+          </w:p>
+        </w:tc>
+        <w:tc>
+          <w:tcPr>
+            <w:tcW w:type="dxa" w:w="2592"/>
+            <w:vAlign w:val="center"/>
+          </w:tcPr>
+          <w:p>
+            <w:r>
+              <w:t>Cumplido</w:t>
+            </w:r>
+          </w:p>
+        </w:tc>
+      </w:tr>
     </w:tbl>
     <w:p/>
     <w:p>
@@ -2109,12 +2337,12 @@
     </w:p>
     <w:p>
       <w:r>
-        <w:t>La Fase 10 queda técnicamente validada con evidencia funcional API y verificación de auditoría. El flujo de planes de acción, evidencias documentales y seguimiento responde a las reglas del módulo de Matrices de Riesgos, mantiene trazabilidad y conserva la separación con los demás módulos del sistema.</w:t>
+        <w:t>La Fase 10 queda aprobada y cerrada con evidencia funcional API y de auditoría, pruebas automatizadas Backend/Frontend/E2E, trazabilidad documental y un procedimiento DBA reproducible de solo lectura. El flujo de planes de acción, evidencias documentales y seguimiento responde a las reglas del módulo de Matrices de Riesgos, mantiene la separación frente a otros módulos y conserva la custodia de los archivos protegidos.</w:t>
       </w:r>
     </w:p>
     <w:p>
       <w:r>
-        <w:t>Siguiente acción requerida: aprobación formal de Javier Mejía para cambiar el estado documental a “Fase 10 aprobada y cerrada” y autorizar la continuidad hacia la Fase 11 conforme al plan vigente.</w:t>
+        <w:t>Acción posterior al cierre: mantener los quality gates activos en GitHub Actions, ejecutar el SQL DBA de solo lectura en cada ambiente institucional que requiera certificación y ratificar externamente el plazo legal de retención antes de habilitar cualquier disposición automática de evidencias.</w:t>
       </w:r>
     </w:p>
     <w:sectPr>

</xml_diff>